<commit_message>
To Implement authentication and Current Four Authentication Files(lib/api.ts, auth/page.tsx, dashboard/layout.tsx, ui/header.tsx ) are now in a good status
</commit_message>
<xml_diff>
--- a/document/login-professional-flow.docx
+++ b/document/login-professional-flow.docx
@@ -346,20 +346,24 @@
     </w:p>
     <w:p>
       <w:proofErr w:type="spellStart"/>
+      <w:proofErr w:type="gramStart"/>
       <w:r>
         <w:t>muhsina.akter</w:t>
       </w:r>
       <w:proofErr w:type="spellEnd"/>
+      <w:proofErr w:type="gramEnd"/>
       <w:r>
         <w:t xml:space="preserve">   02-0501         1</w:t>
       </w:r>
     </w:p>
     <w:p>
       <w:proofErr w:type="spellStart"/>
+      <w:proofErr w:type="gramStart"/>
       <w:r>
         <w:t>nur.hosen</w:t>
       </w:r>
       <w:proofErr w:type="spellEnd"/>
+      <w:proofErr w:type="gramEnd"/>
       <w:r>
         <w:t xml:space="preserve">       02-2014         1</w:t>
       </w:r>
@@ -404,9 +408,11 @@
       </w:r>
     </w:p>
     <w:p>
+      <w:proofErr w:type="gramStart"/>
       <w:r>
         <w:t>Approve</w:t>
       </w:r>
+      <w:proofErr w:type="gramEnd"/>
     </w:p>
     <w:p>
       <w:r>
@@ -426,7 +432,15 @@
     </w:p>
     <w:p>
       <w:r>
-        <w:t>That gives you a proper audit trail.</w:t>
+        <w:t xml:space="preserve">That gives you a proper audit </w:t>
+      </w:r>
+      <w:proofErr w:type="gramStart"/>
+      <w:r>
+        <w:t>trail</w:t>
+      </w:r>
+      <w:proofErr w:type="gramEnd"/>
+      <w:r>
+        <w:t>.</w:t>
       </w:r>
     </w:p>
     <w:p/>
@@ -958,9 +972,14 @@
       </w:r>
       <w:proofErr w:type="spellStart"/>
       <w:r>
-        <w:t>tbl_user_info.status</w:t>
-      </w:r>
-      <w:proofErr w:type="spellEnd"/>
+        <w:t>tbl_user_</w:t>
+      </w:r>
+      <w:proofErr w:type="gramStart"/>
+      <w:r>
+        <w:t>info.status</w:t>
+      </w:r>
+      <w:proofErr w:type="spellEnd"/>
+      <w:proofErr w:type="gramEnd"/>
       <w:r>
         <w:t xml:space="preserve"> can continue mapping 1 → 1, 2 → 2, 3 → 3. </w:t>
       </w:r>
@@ -1194,7 +1213,15 @@
     <w:p/>
     <w:p>
       <w:r>
-        <w:t>NOTICE:  column "</w:t>
+        <w:t>NOTICE</w:t>
+      </w:r>
+      <w:proofErr w:type="gramStart"/>
+      <w:r>
+        <w:t>:  column</w:t>
+      </w:r>
+      <w:proofErr w:type="gramEnd"/>
+      <w:r>
+        <w:t xml:space="preserve"> "</w:t>
       </w:r>
       <w:proofErr w:type="spellStart"/>
       <w:r>
@@ -1207,7 +1234,15 @@
     </w:p>
     <w:p>
       <w:r>
-        <w:t>NOTICE:  column "</w:t>
+        <w:t>NOTICE</w:t>
+      </w:r>
+      <w:proofErr w:type="gramStart"/>
+      <w:r>
+        <w:t>:  column</w:t>
+      </w:r>
+      <w:proofErr w:type="gramEnd"/>
+      <w:r>
+        <w:t xml:space="preserve"> "</w:t>
       </w:r>
       <w:proofErr w:type="spellStart"/>
       <w:r>
@@ -1220,7 +1255,15 @@
     </w:p>
     <w:p>
       <w:r>
-        <w:t>NOTICE:  trigger "</w:t>
+        <w:t>NOTICE</w:t>
+      </w:r>
+      <w:proofErr w:type="gramStart"/>
+      <w:r>
+        <w:t>:  trigger</w:t>
+      </w:r>
+      <w:proofErr w:type="gramEnd"/>
+      <w:r>
+        <w:t xml:space="preserve"> "</w:t>
       </w:r>
       <w:proofErr w:type="spellStart"/>
       <w:r>
@@ -1231,17 +1274,27 @@
         <w:t>" for relation "</w:t>
       </w:r>
       <w:proofErr w:type="spellStart"/>
+      <w:proofErr w:type="gramStart"/>
       <w:r>
         <w:t>public.users</w:t>
       </w:r>
       <w:proofErr w:type="spellEnd"/>
+      <w:proofErr w:type="gramEnd"/>
       <w:r>
         <w:t>" does not exist, skipping</w:t>
       </w:r>
     </w:p>
     <w:p>
       <w:r>
-        <w:t>NOTICE:  trigger "</w:t>
+        <w:t>NOTICE</w:t>
+      </w:r>
+      <w:proofErr w:type="gramStart"/>
+      <w:r>
+        <w:t>:  trigger</w:t>
+      </w:r>
+      <w:proofErr w:type="gramEnd"/>
+      <w:r>
+        <w:t xml:space="preserve"> "</w:t>
       </w:r>
       <w:proofErr w:type="spellStart"/>
       <w:r>
@@ -1252,8 +1305,13 @@
         <w:t>" for relation "</w:t>
       </w:r>
       <w:proofErr w:type="spellStart"/>
-      <w:r>
-        <w:t>public.auth_roles</w:t>
+      <w:proofErr w:type="gramStart"/>
+      <w:r>
+        <w:t>public.auth</w:t>
+      </w:r>
+      <w:proofErr w:type="gramEnd"/>
+      <w:r>
+        <w:t>_roles</w:t>
       </w:r>
       <w:proofErr w:type="spellEnd"/>
       <w:r>
@@ -1371,8 +1429,13 @@
         <w:t xml:space="preserve">FROM </w:t>
       </w:r>
       <w:proofErr w:type="spellStart"/>
-      <w:r>
-        <w:t>public.auth_permissions</w:t>
+      <w:proofErr w:type="gramStart"/>
+      <w:r>
+        <w:t>public.auth</w:t>
+      </w:r>
+      <w:proofErr w:type="gramEnd"/>
+      <w:r>
+        <w:t>_permissions</w:t>
       </w:r>
       <w:proofErr w:type="spellEnd"/>
     </w:p>
@@ -1388,76 +1451,102 @@
     </w:p>
     <w:p>
       <w:proofErr w:type="spellStart"/>
-      <w:r>
-        <w:t>panel.admin.access</w:t>
-      </w:r>
-      <w:proofErr w:type="spellEnd"/>
-    </w:p>
-    <w:p>
-      <w:proofErr w:type="spellStart"/>
-      <w:r>
-        <w:t>panel.user.access</w:t>
-      </w:r>
-      <w:proofErr w:type="spellEnd"/>
+      <w:proofErr w:type="gramStart"/>
+      <w:r>
+        <w:t>panel.admin</w:t>
+      </w:r>
+      <w:proofErr w:type="gramEnd"/>
+      <w:r>
+        <w:t>.access</w:t>
+      </w:r>
+      <w:proofErr w:type="spellEnd"/>
+    </w:p>
+    <w:p>
+      <w:proofErr w:type="spellStart"/>
+      <w:r>
+        <w:t>panel.</w:t>
+      </w:r>
+      <w:proofErr w:type="gramStart"/>
+      <w:r>
+        <w:t>user.access</w:t>
+      </w:r>
+      <w:proofErr w:type="spellEnd"/>
+      <w:proofErr w:type="gramEnd"/>
     </w:p>
     <w:p/>
     <w:p>
       <w:proofErr w:type="spellStart"/>
+      <w:proofErr w:type="gramStart"/>
       <w:r>
         <w:t>requisition.view</w:t>
       </w:r>
       <w:proofErr w:type="spellEnd"/>
-    </w:p>
-    <w:p>
-      <w:proofErr w:type="spellStart"/>
+      <w:proofErr w:type="gramEnd"/>
+    </w:p>
+    <w:p>
+      <w:proofErr w:type="spellStart"/>
+      <w:proofErr w:type="gramStart"/>
       <w:r>
         <w:t>requisition.approve</w:t>
       </w:r>
       <w:proofErr w:type="spellEnd"/>
-    </w:p>
-    <w:p>
-      <w:proofErr w:type="spellStart"/>
+      <w:proofErr w:type="gramEnd"/>
+    </w:p>
+    <w:p>
+      <w:proofErr w:type="spellStart"/>
+      <w:proofErr w:type="gramStart"/>
       <w:r>
         <w:t>requisition.deliver</w:t>
       </w:r>
       <w:proofErr w:type="spellEnd"/>
+      <w:proofErr w:type="gramEnd"/>
     </w:p>
     <w:p/>
     <w:p>
       <w:proofErr w:type="spellStart"/>
+      <w:proofErr w:type="gramStart"/>
       <w:r>
         <w:t>users.view</w:t>
       </w:r>
       <w:proofErr w:type="spellEnd"/>
-    </w:p>
-    <w:p>
-      <w:proofErr w:type="spellStart"/>
+      <w:proofErr w:type="gramEnd"/>
+    </w:p>
+    <w:p>
+      <w:proofErr w:type="spellStart"/>
+      <w:proofErr w:type="gramStart"/>
       <w:r>
         <w:t>users.manage</w:t>
       </w:r>
       <w:proofErr w:type="spellEnd"/>
+      <w:proofErr w:type="gramEnd"/>
     </w:p>
     <w:p/>
     <w:p>
       <w:proofErr w:type="spellStart"/>
+      <w:proofErr w:type="gramStart"/>
       <w:r>
         <w:t>roles.manage</w:t>
       </w:r>
       <w:proofErr w:type="spellEnd"/>
-    </w:p>
-    <w:p>
-      <w:proofErr w:type="spellStart"/>
+      <w:proofErr w:type="gramEnd"/>
+    </w:p>
+    <w:p>
+      <w:proofErr w:type="spellStart"/>
+      <w:proofErr w:type="gramStart"/>
       <w:r>
         <w:t>audit.view</w:t>
       </w:r>
       <w:proofErr w:type="spellEnd"/>
-    </w:p>
-    <w:p>
-      <w:proofErr w:type="spellStart"/>
+      <w:proofErr w:type="gramEnd"/>
+    </w:p>
+    <w:p>
+      <w:proofErr w:type="spellStart"/>
+      <w:proofErr w:type="gramStart"/>
       <w:r>
         <w:t>system.manage</w:t>
       </w:r>
       <w:proofErr w:type="spellEnd"/>
+      <w:proofErr w:type="gramEnd"/>
     </w:p>
     <w:p>
       <w:pPr>
@@ -1490,10 +1579,12 @@
         <w:t xml:space="preserve">    </w:t>
       </w:r>
       <w:proofErr w:type="spellStart"/>
+      <w:proofErr w:type="gramStart"/>
       <w:r>
         <w:t>r.code</w:t>
       </w:r>
       <w:proofErr w:type="spellEnd"/>
+      <w:proofErr w:type="gramEnd"/>
       <w:r>
         <w:t xml:space="preserve"> AS role,</w:t>
       </w:r>
@@ -1503,10 +1594,12 @@
         <w:t xml:space="preserve">    </w:t>
       </w:r>
       <w:proofErr w:type="spellStart"/>
+      <w:proofErr w:type="gramStart"/>
       <w:r>
         <w:t>p.code</w:t>
       </w:r>
       <w:proofErr w:type="spellEnd"/>
+      <w:proofErr w:type="gramEnd"/>
       <w:r>
         <w:t xml:space="preserve"> AS permission</w:t>
       </w:r>
@@ -1516,8 +1609,13 @@
         <w:t xml:space="preserve">FROM </w:t>
       </w:r>
       <w:proofErr w:type="spellStart"/>
-      <w:r>
-        <w:t>public.auth_role_permissions</w:t>
+      <w:proofErr w:type="gramStart"/>
+      <w:r>
+        <w:t>public.auth</w:t>
+      </w:r>
+      <w:proofErr w:type="gramEnd"/>
+      <w:r>
+        <w:t>_role_permissions</w:t>
       </w:r>
       <w:proofErr w:type="spellEnd"/>
       <w:r>
@@ -1534,8 +1632,13 @@
         <w:t xml:space="preserve">JOIN </w:t>
       </w:r>
       <w:proofErr w:type="spellStart"/>
-      <w:r>
-        <w:t>public.auth_roles</w:t>
+      <w:proofErr w:type="gramStart"/>
+      <w:r>
+        <w:t>public.auth</w:t>
+      </w:r>
+      <w:proofErr w:type="gramEnd"/>
+      <w:r>
+        <w:t>_roles</w:t>
       </w:r>
       <w:proofErr w:type="spellEnd"/>
       <w:r>
@@ -1547,8 +1650,13 @@
         <w:t xml:space="preserve">    ON r.id = </w:t>
       </w:r>
       <w:proofErr w:type="spellStart"/>
-      <w:r>
-        <w:t>rp.role_id</w:t>
+      <w:proofErr w:type="gramStart"/>
+      <w:r>
+        <w:t>rp.role</w:t>
+      </w:r>
+      <w:proofErr w:type="gramEnd"/>
+      <w:r>
+        <w:t>_id</w:t>
       </w:r>
       <w:proofErr w:type="spellEnd"/>
     </w:p>
@@ -1557,8 +1665,13 @@
         <w:t xml:space="preserve">JOIN </w:t>
       </w:r>
       <w:proofErr w:type="spellStart"/>
-      <w:r>
-        <w:t>public.auth_permissions</w:t>
+      <w:proofErr w:type="gramStart"/>
+      <w:r>
+        <w:t>public.auth</w:t>
+      </w:r>
+      <w:proofErr w:type="gramEnd"/>
+      <w:r>
+        <w:t>_permissions</w:t>
       </w:r>
       <w:proofErr w:type="spellEnd"/>
       <w:r>
@@ -1570,8 +1683,13 @@
         <w:t xml:space="preserve">    ON p.id = </w:t>
       </w:r>
       <w:proofErr w:type="spellStart"/>
-      <w:r>
-        <w:t>rp.permission_id</w:t>
+      <w:proofErr w:type="gramStart"/>
+      <w:r>
+        <w:t>rp.permission</w:t>
+      </w:r>
+      <w:proofErr w:type="gramEnd"/>
+      <w:r>
+        <w:t>_id</w:t>
       </w:r>
       <w:proofErr w:type="spellEnd"/>
     </w:p>
@@ -1585,8 +1703,13 @@
         <w:t xml:space="preserve">    </w:t>
       </w:r>
       <w:proofErr w:type="spellStart"/>
-      <w:r>
-        <w:t>r.hierarchy_level</w:t>
+      <w:proofErr w:type="gramStart"/>
+      <w:r>
+        <w:t>r.hierarchy</w:t>
+      </w:r>
+      <w:proofErr w:type="gramEnd"/>
+      <w:r>
+        <w:t>_level</w:t>
       </w:r>
       <w:proofErr w:type="spellEnd"/>
       <w:r>
@@ -1598,10 +1721,12 @@
         <w:t xml:space="preserve">    </w:t>
       </w:r>
       <w:proofErr w:type="spellStart"/>
+      <w:proofErr w:type="gramStart"/>
       <w:r>
         <w:t>p.code</w:t>
       </w:r>
       <w:proofErr w:type="spellEnd"/>
+      <w:proofErr w:type="gramEnd"/>
       <w:r>
         <w:t>;</w:t>
       </w:r>
@@ -1632,8 +1757,13 @@
         <w:t xml:space="preserve">    </w:t>
       </w:r>
       <w:proofErr w:type="spellStart"/>
-      <w:r>
-        <w:t>panel.admin.access</w:t>
+      <w:proofErr w:type="gramStart"/>
+      <w:r>
+        <w:t>panel.admin</w:t>
+      </w:r>
+      <w:proofErr w:type="gramEnd"/>
+      <w:r>
+        <w:t>.access</w:t>
       </w:r>
       <w:proofErr w:type="spellEnd"/>
     </w:p>
@@ -1643,69 +1773,86 @@
       </w:r>
       <w:proofErr w:type="spellStart"/>
       <w:r>
-        <w:t>panel.user.access</w:t>
-      </w:r>
-      <w:proofErr w:type="spellEnd"/>
+        <w:t>panel.</w:t>
+      </w:r>
+      <w:proofErr w:type="gramStart"/>
+      <w:r>
+        <w:t>user.access</w:t>
+      </w:r>
+      <w:proofErr w:type="spellEnd"/>
+      <w:proofErr w:type="gramEnd"/>
     </w:p>
     <w:p>
       <w:r>
         <w:t xml:space="preserve">    </w:t>
       </w:r>
       <w:proofErr w:type="spellStart"/>
+      <w:proofErr w:type="gramStart"/>
       <w:r>
         <w:t>requisition.view</w:t>
       </w:r>
       <w:proofErr w:type="spellEnd"/>
+      <w:proofErr w:type="gramEnd"/>
     </w:p>
     <w:p>
       <w:r>
         <w:t xml:space="preserve">    </w:t>
       </w:r>
       <w:proofErr w:type="spellStart"/>
+      <w:proofErr w:type="gramStart"/>
       <w:r>
         <w:t>requisition.approve</w:t>
       </w:r>
       <w:proofErr w:type="spellEnd"/>
+      <w:proofErr w:type="gramEnd"/>
     </w:p>
     <w:p>
       <w:r>
         <w:t xml:space="preserve">    </w:t>
       </w:r>
       <w:proofErr w:type="spellStart"/>
+      <w:proofErr w:type="gramStart"/>
       <w:r>
         <w:t>requisition.deliver</w:t>
       </w:r>
       <w:proofErr w:type="spellEnd"/>
+      <w:proofErr w:type="gramEnd"/>
     </w:p>
     <w:p>
       <w:r>
         <w:t xml:space="preserve">    </w:t>
       </w:r>
       <w:proofErr w:type="spellStart"/>
+      <w:proofErr w:type="gramStart"/>
       <w:r>
         <w:t>users.view</w:t>
       </w:r>
       <w:proofErr w:type="spellEnd"/>
+      <w:proofErr w:type="gramEnd"/>
     </w:p>
     <w:p>
       <w:r>
         <w:t xml:space="preserve">    </w:t>
       </w:r>
       <w:proofErr w:type="spellStart"/>
+      <w:proofErr w:type="gramStart"/>
       <w:r>
         <w:t>users.manage</w:t>
       </w:r>
       <w:proofErr w:type="spellEnd"/>
+      <w:proofErr w:type="gramEnd"/>
     </w:p>
     <w:p>
       <w:r>
         <w:t xml:space="preserve">    </w:t>
       </w:r>
       <w:proofErr w:type="spellStart"/>
+      <w:proofErr w:type="gramStart"/>
       <w:r>
         <w:t>audit.view</w:t>
       </w:r>
       <w:proofErr w:type="spellEnd"/>
+      <w:proofErr w:type="gramEnd"/>
     </w:p>
     <w:p/>
     <w:p>
@@ -1720,39 +1867,50 @@
       </w:r>
       <w:proofErr w:type="spellStart"/>
       <w:r>
-        <w:t>panel.user.access</w:t>
-      </w:r>
-      <w:proofErr w:type="spellEnd"/>
+        <w:t>panel.</w:t>
+      </w:r>
+      <w:proofErr w:type="gramStart"/>
+      <w:r>
+        <w:t>user.access</w:t>
+      </w:r>
+      <w:proofErr w:type="spellEnd"/>
+      <w:proofErr w:type="gramEnd"/>
     </w:p>
     <w:p>
       <w:r>
         <w:t xml:space="preserve">    </w:t>
       </w:r>
       <w:proofErr w:type="spellStart"/>
+      <w:proofErr w:type="gramStart"/>
       <w:r>
         <w:t>requisition.view</w:t>
       </w:r>
       <w:proofErr w:type="spellEnd"/>
+      <w:proofErr w:type="gramEnd"/>
     </w:p>
     <w:p>
       <w:r>
         <w:t xml:space="preserve">    </w:t>
       </w:r>
       <w:proofErr w:type="spellStart"/>
+      <w:proofErr w:type="gramStart"/>
       <w:r>
         <w:t>requisition.approve</w:t>
       </w:r>
       <w:proofErr w:type="spellEnd"/>
+      <w:proofErr w:type="gramEnd"/>
     </w:p>
     <w:p>
       <w:r>
         <w:t xml:space="preserve">    </w:t>
       </w:r>
       <w:proofErr w:type="spellStart"/>
+      <w:proofErr w:type="gramStart"/>
       <w:r>
         <w:t>requisition.deliver</w:t>
       </w:r>
       <w:proofErr w:type="spellEnd"/>
+      <w:proofErr w:type="gramEnd"/>
     </w:p>
     <w:p/>
     <w:p>
@@ -1766,19 +1924,26 @@
       </w:r>
       <w:proofErr w:type="spellStart"/>
       <w:r>
-        <w:t>panel.user.access</w:t>
-      </w:r>
-      <w:proofErr w:type="spellEnd"/>
+        <w:t>panel.</w:t>
+      </w:r>
+      <w:proofErr w:type="gramStart"/>
+      <w:r>
+        <w:t>user.access</w:t>
+      </w:r>
+      <w:proofErr w:type="spellEnd"/>
+      <w:proofErr w:type="gramEnd"/>
     </w:p>
     <w:p>
       <w:r>
         <w:t xml:space="preserve">    </w:t>
       </w:r>
       <w:proofErr w:type="spellStart"/>
+      <w:proofErr w:type="gramStart"/>
       <w:r>
         <w:t>requisition.view</w:t>
       </w:r>
       <w:proofErr w:type="spellEnd"/>
+      <w:proofErr w:type="gramEnd"/>
     </w:p>
     <w:p>
       <w:pPr>
@@ -1815,8 +1980,13 @@
         <w:t xml:space="preserve">    </w:t>
       </w:r>
       <w:proofErr w:type="spellStart"/>
-      <w:r>
-        <w:t>u.employee_id</w:t>
+      <w:proofErr w:type="gramStart"/>
+      <w:r>
+        <w:t>u.employee</w:t>
+      </w:r>
+      <w:proofErr w:type="gramEnd"/>
+      <w:r>
+        <w:t>_id</w:t>
       </w:r>
       <w:proofErr w:type="spellEnd"/>
       <w:r>
@@ -1828,10 +1998,12 @@
         <w:t xml:space="preserve">    </w:t>
       </w:r>
       <w:proofErr w:type="spellStart"/>
+      <w:proofErr w:type="gramStart"/>
       <w:r>
         <w:t>u.username</w:t>
       </w:r>
       <w:proofErr w:type="spellEnd"/>
+      <w:proofErr w:type="gramEnd"/>
       <w:r>
         <w:t>,</w:t>
       </w:r>
@@ -1841,8 +2013,13 @@
         <w:t xml:space="preserve">    </w:t>
       </w:r>
       <w:proofErr w:type="spellStart"/>
-      <w:r>
-        <w:t>u.full_name</w:t>
+      <w:proofErr w:type="gramStart"/>
+      <w:r>
+        <w:t>u.full</w:t>
+      </w:r>
+      <w:proofErr w:type="gramEnd"/>
+      <w:r>
+        <w:t>_name</w:t>
       </w:r>
       <w:proofErr w:type="spellEnd"/>
       <w:r>
@@ -1867,10 +2044,12 @@
         <w:t xml:space="preserve">    </w:t>
       </w:r>
       <w:proofErr w:type="spellStart"/>
+      <w:proofErr w:type="gramStart"/>
       <w:r>
         <w:t>r.code</w:t>
       </w:r>
       <w:proofErr w:type="spellEnd"/>
+      <w:proofErr w:type="gramEnd"/>
       <w:r>
         <w:t xml:space="preserve"> AS </w:t>
       </w:r>
@@ -1898,10 +2077,12 @@
         <w:t xml:space="preserve">FROM </w:t>
       </w:r>
       <w:proofErr w:type="spellStart"/>
+      <w:proofErr w:type="gramStart"/>
       <w:r>
         <w:t>public.users</w:t>
       </w:r>
       <w:proofErr w:type="spellEnd"/>
+      <w:proofErr w:type="gramEnd"/>
       <w:r>
         <w:t xml:space="preserve"> u</w:t>
       </w:r>
@@ -1911,8 +2092,13 @@
         <w:t xml:space="preserve">LEFT JOIN </w:t>
       </w:r>
       <w:proofErr w:type="spellStart"/>
-      <w:r>
-        <w:t>public.auth_user_roles</w:t>
+      <w:proofErr w:type="gramStart"/>
+      <w:r>
+        <w:t>public.auth</w:t>
+      </w:r>
+      <w:proofErr w:type="gramEnd"/>
+      <w:r>
+        <w:t>_user_roles</w:t>
       </w:r>
       <w:proofErr w:type="spellEnd"/>
       <w:r>
@@ -1942,10 +2128,12 @@
         <w:t xml:space="preserve">   AND </w:t>
       </w:r>
       <w:proofErr w:type="spellStart"/>
+      <w:proofErr w:type="gramStart"/>
       <w:r>
         <w:t>ur.active</w:t>
       </w:r>
       <w:proofErr w:type="spellEnd"/>
+      <w:proofErr w:type="gramEnd"/>
       <w:r>
         <w:t xml:space="preserve"> = TRUE</w:t>
       </w:r>
@@ -1955,8 +2143,13 @@
         <w:t xml:space="preserve">LEFT JOIN </w:t>
       </w:r>
       <w:proofErr w:type="spellStart"/>
-      <w:r>
-        <w:t>public.auth_roles</w:t>
+      <w:proofErr w:type="gramStart"/>
+      <w:r>
+        <w:t>public.auth</w:t>
+      </w:r>
+      <w:proofErr w:type="gramEnd"/>
+      <w:r>
+        <w:t>_roles</w:t>
       </w:r>
       <w:proofErr w:type="spellEnd"/>
       <w:r>
@@ -1968,8 +2161,13 @@
         <w:t xml:space="preserve">    ON r.id = </w:t>
       </w:r>
       <w:proofErr w:type="spellStart"/>
-      <w:r>
-        <w:t>ur.role_id</w:t>
+      <w:proofErr w:type="gramStart"/>
+      <w:r>
+        <w:t>ur.role</w:t>
+      </w:r>
+      <w:proofErr w:type="gramEnd"/>
+      <w:r>
+        <w:t>_id</w:t>
       </w:r>
       <w:proofErr w:type="spellEnd"/>
     </w:p>
@@ -1978,10 +2176,12 @@
         <w:t>WHERE LOWER(</w:t>
       </w:r>
       <w:proofErr w:type="spellStart"/>
+      <w:proofErr w:type="gramStart"/>
       <w:r>
         <w:t>u.username</w:t>
       </w:r>
       <w:proofErr w:type="spellEnd"/>
+      <w:proofErr w:type="gramEnd"/>
       <w:r>
         <w:t>) = 'admin';</w:t>
       </w:r>
@@ -2067,8 +2267,13 @@
         <w:t xml:space="preserve">    </w:t>
       </w:r>
       <w:proofErr w:type="spellStart"/>
-      <w:r>
-        <w:t>u.employee_id</w:t>
+      <w:proofErr w:type="gramStart"/>
+      <w:r>
+        <w:t>u.employee</w:t>
+      </w:r>
+      <w:proofErr w:type="gramEnd"/>
+      <w:r>
+        <w:t>_id</w:t>
       </w:r>
       <w:proofErr w:type="spellEnd"/>
       <w:r>
@@ -2080,10 +2285,12 @@
         <w:t xml:space="preserve">    </w:t>
       </w:r>
       <w:proofErr w:type="spellStart"/>
+      <w:proofErr w:type="gramStart"/>
       <w:r>
         <w:t>u.username</w:t>
       </w:r>
       <w:proofErr w:type="spellEnd"/>
+      <w:proofErr w:type="gramEnd"/>
       <w:r>
         <w:t>,</w:t>
       </w:r>
@@ -2093,8 +2300,13 @@
         <w:t xml:space="preserve">    </w:t>
       </w:r>
       <w:proofErr w:type="spellStart"/>
-      <w:r>
-        <w:t>u.full_name</w:t>
+      <w:proofErr w:type="gramStart"/>
+      <w:r>
+        <w:t>u.full</w:t>
+      </w:r>
+      <w:proofErr w:type="gramEnd"/>
+      <w:r>
+        <w:t>_name</w:t>
       </w:r>
       <w:proofErr w:type="spellEnd"/>
       <w:r>
@@ -2119,8 +2331,13 @@
         <w:t xml:space="preserve">    </w:t>
       </w:r>
       <w:proofErr w:type="spellStart"/>
-      <w:r>
-        <w:t>u.account_status</w:t>
+      <w:proofErr w:type="gramStart"/>
+      <w:r>
+        <w:t>u.account</w:t>
+      </w:r>
+      <w:proofErr w:type="gramEnd"/>
+      <w:r>
+        <w:t>_status</w:t>
       </w:r>
       <w:proofErr w:type="spellEnd"/>
       <w:r>
@@ -2132,10 +2349,12 @@
         <w:t xml:space="preserve">    </w:t>
       </w:r>
       <w:proofErr w:type="spellStart"/>
+      <w:proofErr w:type="gramStart"/>
       <w:r>
         <w:t>u.active</w:t>
       </w:r>
       <w:proofErr w:type="spellEnd"/>
+      <w:proofErr w:type="gramEnd"/>
       <w:r>
         <w:t>,</w:t>
       </w:r>
@@ -2145,10 +2364,12 @@
         <w:t xml:space="preserve">    </w:t>
       </w:r>
       <w:proofErr w:type="spellStart"/>
+      <w:proofErr w:type="gramStart"/>
       <w:r>
         <w:t>r.code</w:t>
       </w:r>
       <w:proofErr w:type="spellEnd"/>
+      <w:proofErr w:type="gramEnd"/>
       <w:r>
         <w:t xml:space="preserve"> AS role</w:t>
       </w:r>
@@ -2158,10 +2379,12 @@
         <w:t xml:space="preserve">FROM </w:t>
       </w:r>
       <w:proofErr w:type="spellStart"/>
+      <w:proofErr w:type="gramStart"/>
       <w:r>
         <w:t>public.users</w:t>
       </w:r>
       <w:proofErr w:type="spellEnd"/>
+      <w:proofErr w:type="gramEnd"/>
       <w:r>
         <w:t xml:space="preserve"> u</w:t>
       </w:r>
@@ -2171,8 +2394,13 @@
         <w:t xml:space="preserve">LEFT JOIN </w:t>
       </w:r>
       <w:proofErr w:type="spellStart"/>
-      <w:r>
-        <w:t>public.auth_user_roles</w:t>
+      <w:proofErr w:type="gramStart"/>
+      <w:r>
+        <w:t>public.auth</w:t>
+      </w:r>
+      <w:proofErr w:type="gramEnd"/>
+      <w:r>
+        <w:t>_user_roles</w:t>
       </w:r>
       <w:proofErr w:type="spellEnd"/>
       <w:r>
@@ -2202,10 +2430,12 @@
         <w:t xml:space="preserve">   AND </w:t>
       </w:r>
       <w:proofErr w:type="spellStart"/>
+      <w:proofErr w:type="gramStart"/>
       <w:r>
         <w:t>ur.active</w:t>
       </w:r>
       <w:proofErr w:type="spellEnd"/>
+      <w:proofErr w:type="gramEnd"/>
       <w:r>
         <w:t xml:space="preserve"> = TRUE</w:t>
       </w:r>
@@ -2215,8 +2445,13 @@
         <w:t xml:space="preserve">LEFT JOIN </w:t>
       </w:r>
       <w:proofErr w:type="spellStart"/>
-      <w:r>
-        <w:t>public.auth_roles</w:t>
+      <w:proofErr w:type="gramStart"/>
+      <w:r>
+        <w:t>public.auth</w:t>
+      </w:r>
+      <w:proofErr w:type="gramEnd"/>
+      <w:r>
+        <w:t>_roles</w:t>
       </w:r>
       <w:proofErr w:type="spellEnd"/>
       <w:r>
@@ -2228,8 +2463,13 @@
         <w:t xml:space="preserve">    ON r.id = </w:t>
       </w:r>
       <w:proofErr w:type="spellStart"/>
-      <w:r>
-        <w:t>ur.role_id</w:t>
+      <w:proofErr w:type="gramStart"/>
+      <w:r>
+        <w:t>ur.role</w:t>
+      </w:r>
+      <w:proofErr w:type="gramEnd"/>
+      <w:r>
+        <w:t>_id</w:t>
       </w:r>
       <w:proofErr w:type="spellEnd"/>
     </w:p>
@@ -2238,8 +2478,13 @@
         <w:t xml:space="preserve">WHERE </w:t>
       </w:r>
       <w:proofErr w:type="spellStart"/>
-      <w:r>
-        <w:t>u.deleted_at</w:t>
+      <w:proofErr w:type="gramStart"/>
+      <w:r>
+        <w:t>u.deleted</w:t>
+      </w:r>
+      <w:proofErr w:type="gramEnd"/>
+      <w:r>
+        <w:t>_at</w:t>
       </w:r>
       <w:proofErr w:type="spellEnd"/>
       <w:r>
@@ -2313,7 +2558,15 @@
     </w:p>
     <w:p>
       <w:r>
-        <w:t xml:space="preserve">    COUNT(*) AS total</w:t>
+        <w:t xml:space="preserve">    </w:t>
+      </w:r>
+      <w:proofErr w:type="gramStart"/>
+      <w:r>
+        <w:t>COUNT(</w:t>
+      </w:r>
+      <w:proofErr w:type="gramEnd"/>
+      <w:r>
+        <w:t>*) AS total</w:t>
       </w:r>
     </w:p>
     <w:p>
@@ -2321,10 +2574,12 @@
         <w:t xml:space="preserve">FROM </w:t>
       </w:r>
       <w:proofErr w:type="spellStart"/>
+      <w:proofErr w:type="gramStart"/>
       <w:r>
         <w:t>public.users</w:t>
       </w:r>
       <w:proofErr w:type="spellEnd"/>
+      <w:proofErr w:type="gramEnd"/>
     </w:p>
     <w:p>
       <w:r>
@@ -2384,10 +2639,12 @@
         <w:t xml:space="preserve">ALTER TABLE </w:t>
       </w:r>
       <w:proofErr w:type="spellStart"/>
+      <w:proofErr w:type="gramStart"/>
       <w:r>
         <w:t>public.users</w:t>
       </w:r>
       <w:proofErr w:type="spellEnd"/>
+      <w:proofErr w:type="gramEnd"/>
     </w:p>
     <w:p>
       <w:r>
@@ -2457,10 +2714,12 @@
         <w:t xml:space="preserve">1. Rewrite </w:t>
       </w:r>
       <w:proofErr w:type="spellStart"/>
+      <w:proofErr w:type="gramStart"/>
       <w:r>
         <w:t>auth.go</w:t>
       </w:r>
       <w:proofErr w:type="spellEnd"/>
+      <w:proofErr w:type="gramEnd"/>
     </w:p>
     <w:p>
       <w:r>
@@ -2584,8 +2843,13 @@
         <w:t xml:space="preserve">FROM </w:t>
       </w:r>
       <w:proofErr w:type="spellStart"/>
-      <w:r>
-        <w:t>public.auth_roles</w:t>
+      <w:proofErr w:type="gramStart"/>
+      <w:r>
+        <w:t>public.auth</w:t>
+      </w:r>
+      <w:proofErr w:type="gramEnd"/>
+      <w:r>
+        <w:t>_roles</w:t>
       </w:r>
       <w:proofErr w:type="spellEnd"/>
     </w:p>
@@ -2622,8 +2886,13 @@
         <w:t xml:space="preserve">    </w:t>
       </w:r>
       <w:proofErr w:type="spellStart"/>
-      <w:r>
-        <w:t>u.employee_id</w:t>
+      <w:proofErr w:type="gramStart"/>
+      <w:r>
+        <w:t>u.employee</w:t>
+      </w:r>
+      <w:proofErr w:type="gramEnd"/>
+      <w:r>
+        <w:t>_id</w:t>
       </w:r>
       <w:proofErr w:type="spellEnd"/>
       <w:r>
@@ -2635,10 +2904,12 @@
         <w:t xml:space="preserve">    </w:t>
       </w:r>
       <w:proofErr w:type="spellStart"/>
+      <w:proofErr w:type="gramStart"/>
       <w:r>
         <w:t>u.username</w:t>
       </w:r>
       <w:proofErr w:type="spellEnd"/>
+      <w:proofErr w:type="gramEnd"/>
       <w:r>
         <w:t>,</w:t>
       </w:r>
@@ -2648,8 +2919,13 @@
         <w:t xml:space="preserve">    </w:t>
       </w:r>
       <w:proofErr w:type="spellStart"/>
-      <w:r>
-        <w:t>u.full_name</w:t>
+      <w:proofErr w:type="gramStart"/>
+      <w:r>
+        <w:t>u.full</w:t>
+      </w:r>
+      <w:proofErr w:type="gramEnd"/>
+      <w:r>
+        <w:t>_name</w:t>
       </w:r>
       <w:proofErr w:type="spellEnd"/>
       <w:r>
@@ -2674,10 +2950,12 @@
         <w:t xml:space="preserve">    </w:t>
       </w:r>
       <w:proofErr w:type="spellStart"/>
+      <w:proofErr w:type="gramStart"/>
       <w:r>
         <w:t>r.code</w:t>
       </w:r>
       <w:proofErr w:type="spellEnd"/>
+      <w:proofErr w:type="gramEnd"/>
       <w:r>
         <w:t xml:space="preserve"> AS role</w:t>
       </w:r>
@@ -2687,10 +2965,12 @@
         <w:t xml:space="preserve">FROM </w:t>
       </w:r>
       <w:proofErr w:type="spellStart"/>
+      <w:proofErr w:type="gramStart"/>
       <w:r>
         <w:t>public.users</w:t>
       </w:r>
       <w:proofErr w:type="spellEnd"/>
+      <w:proofErr w:type="gramEnd"/>
       <w:r>
         <w:t xml:space="preserve"> u</w:t>
       </w:r>
@@ -2701,8 +2981,13 @@
         <w:t xml:space="preserve">LEFT JOIN </w:t>
       </w:r>
       <w:proofErr w:type="spellStart"/>
-      <w:r>
-        <w:t>public.auth_user_roles</w:t>
+      <w:proofErr w:type="gramStart"/>
+      <w:r>
+        <w:t>public.auth</w:t>
+      </w:r>
+      <w:proofErr w:type="gramEnd"/>
+      <w:r>
+        <w:t>_user_roles</w:t>
       </w:r>
       <w:proofErr w:type="spellEnd"/>
       <w:r>
@@ -2732,10 +3017,12 @@
         <w:t xml:space="preserve">   AND </w:t>
       </w:r>
       <w:proofErr w:type="spellStart"/>
+      <w:proofErr w:type="gramStart"/>
       <w:r>
         <w:t>ur.active</w:t>
       </w:r>
       <w:proofErr w:type="spellEnd"/>
+      <w:proofErr w:type="gramEnd"/>
       <w:r>
         <w:t xml:space="preserve"> = TRUE</w:t>
       </w:r>
@@ -2745,8 +3032,13 @@
         <w:t xml:space="preserve">LEFT JOIN </w:t>
       </w:r>
       <w:proofErr w:type="spellStart"/>
-      <w:r>
-        <w:t>public.auth_roles</w:t>
+      <w:proofErr w:type="gramStart"/>
+      <w:r>
+        <w:t>public.auth</w:t>
+      </w:r>
+      <w:proofErr w:type="gramEnd"/>
+      <w:r>
+        <w:t>_roles</w:t>
       </w:r>
       <w:proofErr w:type="spellEnd"/>
       <w:r>
@@ -2758,8 +3050,13 @@
         <w:t xml:space="preserve">    ON r.id = </w:t>
       </w:r>
       <w:proofErr w:type="spellStart"/>
-      <w:r>
-        <w:t>ur.role_id</w:t>
+      <w:proofErr w:type="gramStart"/>
+      <w:r>
+        <w:t>ur.role</w:t>
+      </w:r>
+      <w:proofErr w:type="gramEnd"/>
+      <w:r>
+        <w:t>_id</w:t>
       </w:r>
       <w:proofErr w:type="spellEnd"/>
     </w:p>
@@ -2780,6 +3077,7 @@
         <w:t>next step will be backend/internal/handler/</w:t>
       </w:r>
       <w:proofErr w:type="spellStart"/>
+      <w:proofErr w:type="gramStart"/>
       <w:r>
         <w:rPr>
           <w:b/>
@@ -2788,6 +3086,7 @@
         <w:t>auth.go</w:t>
       </w:r>
       <w:proofErr w:type="spellEnd"/>
+      <w:proofErr w:type="gramEnd"/>
       <w:r>
         <w:t>, and I’ll rewrite the complete file for the new professional role/permission architecture.</w:t>
       </w:r>
@@ -3630,8 +3929,13 @@
         <w:t xml:space="preserve">FROM </w:t>
       </w:r>
       <w:proofErr w:type="spellStart"/>
-      <w:r>
-        <w:t>public.auth_roles</w:t>
+      <w:proofErr w:type="gramStart"/>
+      <w:r>
+        <w:t>public.auth</w:t>
+      </w:r>
+      <w:proofErr w:type="gramEnd"/>
+      <w:r>
+        <w:t>_roles</w:t>
       </w:r>
       <w:proofErr w:type="spellEnd"/>
     </w:p>
@@ -3703,6 +4007,2573 @@
     <w:p>
       <w:r>
         <w:t>Step 1 — Verify the new security tables</w:t>
+      </w:r>
+    </w:p>
+    <w:p/>
+    <w:p>
+      <w:r>
+        <w:drawing>
+          <wp:inline distT="0" distB="0" distL="0" distR="0" wp14:anchorId="355EC3FD" wp14:editId="20854ABB">
+            <wp:extent cx="5943600" cy="3204210"/>
+            <wp:effectExtent l="0" t="0" r="0" b="0"/>
+            <wp:docPr id="1032322873" name="Picture 1"/>
+            <wp:cNvGraphicFramePr>
+              <a:graphicFrameLocks xmlns:a="http://schemas.openxmlformats.org/drawingml/2006/main" noChangeAspect="1"/>
+            </wp:cNvGraphicFramePr>
+            <a:graphic xmlns:a="http://schemas.openxmlformats.org/drawingml/2006/main">
+              <a:graphicData uri="http://schemas.openxmlformats.org/drawingml/2006/picture">
+                <pic:pic xmlns:pic="http://schemas.openxmlformats.org/drawingml/2006/picture">
+                  <pic:nvPicPr>
+                    <pic:cNvPr id="1032322873" name=""/>
+                    <pic:cNvPicPr/>
+                  </pic:nvPicPr>
+                  <pic:blipFill>
+                    <a:blip r:embed="rId8"/>
+                    <a:stretch>
+                      <a:fillRect/>
+                    </a:stretch>
+                  </pic:blipFill>
+                  <pic:spPr>
+                    <a:xfrm>
+                      <a:off x="0" y="0"/>
+                      <a:ext cx="5943600" cy="3204210"/>
+                    </a:xfrm>
+                    <a:prstGeom prst="rect">
+                      <a:avLst/>
+                    </a:prstGeom>
+                  </pic:spPr>
+                </pic:pic>
+              </a:graphicData>
+            </a:graphic>
+          </wp:inline>
+        </w:drawing>
+      </w:r>
+    </w:p>
+    <w:p/>
+    <w:p/>
+    <w:p>
+      <w:r>
+        <w:lastRenderedPageBreak/>
+        <w:drawing>
+          <wp:inline distT="0" distB="0" distL="0" distR="0" wp14:anchorId="6D077D33" wp14:editId="3C061973">
+            <wp:extent cx="5943600" cy="3151505"/>
+            <wp:effectExtent l="0" t="0" r="0" b="0"/>
+            <wp:docPr id="406759625" name="Picture 1"/>
+            <wp:cNvGraphicFramePr>
+              <a:graphicFrameLocks xmlns:a="http://schemas.openxmlformats.org/drawingml/2006/main" noChangeAspect="1"/>
+            </wp:cNvGraphicFramePr>
+            <a:graphic xmlns:a="http://schemas.openxmlformats.org/drawingml/2006/main">
+              <a:graphicData uri="http://schemas.openxmlformats.org/drawingml/2006/picture">
+                <pic:pic xmlns:pic="http://schemas.openxmlformats.org/drawingml/2006/picture">
+                  <pic:nvPicPr>
+                    <pic:cNvPr id="406759625" name=""/>
+                    <pic:cNvPicPr/>
+                  </pic:nvPicPr>
+                  <pic:blipFill>
+                    <a:blip r:embed="rId9"/>
+                    <a:stretch>
+                      <a:fillRect/>
+                    </a:stretch>
+                  </pic:blipFill>
+                  <pic:spPr>
+                    <a:xfrm>
+                      <a:off x="0" y="0"/>
+                      <a:ext cx="5943600" cy="3151505"/>
+                    </a:xfrm>
+                    <a:prstGeom prst="rect">
+                      <a:avLst/>
+                    </a:prstGeom>
+                  </pic:spPr>
+                </pic:pic>
+              </a:graphicData>
+            </a:graphic>
+          </wp:inline>
+        </w:drawing>
+      </w:r>
+    </w:p>
+    <w:p/>
+    <w:p>
+      <w:r>
+        <w:t xml:space="preserve">Yes. You already have the correct place for JWT authentication: </w:t>
+      </w:r>
+      <w:r>
+        <w:rPr>
+          <w:b/>
+          <w:bCs/>
+        </w:rPr>
+        <w:t>backend/internal/middleware/</w:t>
+      </w:r>
+      <w:proofErr w:type="spellStart"/>
+      <w:r>
+        <w:rPr>
+          <w:b/>
+          <w:bCs/>
+        </w:rPr>
+        <w:t>middleware.go</w:t>
+      </w:r>
+      <w:proofErr w:type="spellEnd"/>
+      <w:r>
+        <w:t>. We should upgrade it first and leave handler/</w:t>
+      </w:r>
+      <w:proofErr w:type="spellStart"/>
+      <w:proofErr w:type="gramStart"/>
+      <w:r>
+        <w:t>auth.go</w:t>
+      </w:r>
+      <w:proofErr w:type="spellEnd"/>
+      <w:proofErr w:type="gramEnd"/>
+      <w:r>
+        <w:t xml:space="preserve"> and </w:t>
+      </w:r>
+      <w:proofErr w:type="spellStart"/>
+      <w:proofErr w:type="gramStart"/>
+      <w:r>
+        <w:t>main.go</w:t>
+      </w:r>
+      <w:proofErr w:type="spellEnd"/>
+      <w:proofErr w:type="gramEnd"/>
+      <w:r>
+        <w:t xml:space="preserve"> unchanged for this step.</w:t>
+      </w:r>
+    </w:p>
+    <w:p/>
+    <w:p/>
+    <w:p/>
+    <w:p/>
+    <w:p/>
+    <w:p/>
+    <w:p/>
+    <w:p/>
+    <w:p/>
+    <w:p/>
+    <w:p/>
+    <w:p/>
+    <w:p/>
+    <w:p>
+      <w:r>
+        <w:t xml:space="preserve">Yes. You already have the correct place for JWT authentication: </w:t>
+      </w:r>
+      <w:r>
+        <w:rPr>
+          <w:b/>
+          <w:bCs/>
+        </w:rPr>
+        <w:t>backend/internal/middleware/</w:t>
+      </w:r>
+      <w:proofErr w:type="spellStart"/>
+      <w:r>
+        <w:rPr>
+          <w:b/>
+          <w:bCs/>
+        </w:rPr>
+        <w:t>middleware.go</w:t>
+      </w:r>
+      <w:proofErr w:type="spellEnd"/>
+      <w:r>
+        <w:t>. We should upgrade it first and leave handler/</w:t>
+      </w:r>
+      <w:proofErr w:type="spellStart"/>
+      <w:proofErr w:type="gramStart"/>
+      <w:r>
+        <w:t>auth.go</w:t>
+      </w:r>
+      <w:proofErr w:type="spellEnd"/>
+      <w:proofErr w:type="gramEnd"/>
+      <w:r>
+        <w:t xml:space="preserve"> and </w:t>
+      </w:r>
+      <w:proofErr w:type="spellStart"/>
+      <w:proofErr w:type="gramStart"/>
+      <w:r>
+        <w:t>main.go</w:t>
+      </w:r>
+      <w:proofErr w:type="spellEnd"/>
+      <w:proofErr w:type="gramEnd"/>
+      <w:r>
+        <w:t xml:space="preserve"> unchanged for this step.</w:t>
+      </w:r>
+    </w:p>
+    <w:p>
+      <w:r>
+        <w:t>This is the safest order:</w:t>
+      </w:r>
+    </w:p>
+    <w:p>
+      <w:r>
+        <w:t xml:space="preserve">STEP </w:t>
+      </w:r>
+      <w:proofErr w:type="gramStart"/>
+      <w:r>
+        <w:t>1  middleware</w:t>
+      </w:r>
+      <w:proofErr w:type="gramEnd"/>
+      <w:r>
+        <w:t>/</w:t>
+      </w:r>
+      <w:proofErr w:type="spellStart"/>
+      <w:proofErr w:type="gramStart"/>
+      <w:r>
+        <w:t>middleware.go</w:t>
+      </w:r>
+      <w:proofErr w:type="spellEnd"/>
+      <w:proofErr w:type="gramEnd"/>
+      <w:r>
+        <w:t xml:space="preserve">     ← NOW</w:t>
+      </w:r>
+    </w:p>
+    <w:p>
+      <w:r>
+        <w:t xml:space="preserve">STEP </w:t>
+      </w:r>
+      <w:proofErr w:type="gramStart"/>
+      <w:r>
+        <w:t>2  handler</w:t>
+      </w:r>
+      <w:proofErr w:type="gramEnd"/>
+      <w:r>
+        <w:t>/</w:t>
+      </w:r>
+      <w:proofErr w:type="spellStart"/>
+      <w:proofErr w:type="gramStart"/>
+      <w:r>
+        <w:t>auth.go</w:t>
+      </w:r>
+      <w:proofErr w:type="spellEnd"/>
+      <w:proofErr w:type="gramEnd"/>
+    </w:p>
+    <w:p>
+      <w:r>
+        <w:t xml:space="preserve">STEP </w:t>
+      </w:r>
+      <w:proofErr w:type="gramStart"/>
+      <w:r>
+        <w:t>3  middleware</w:t>
+      </w:r>
+      <w:proofErr w:type="gramEnd"/>
+      <w:r>
+        <w:t>/</w:t>
+      </w:r>
+      <w:proofErr w:type="spellStart"/>
+      <w:proofErr w:type="gramStart"/>
+      <w:r>
+        <w:t>permission.go</w:t>
+      </w:r>
+      <w:proofErr w:type="spellEnd"/>
+      <w:proofErr w:type="gramEnd"/>
+    </w:p>
+    <w:p>
+      <w:r>
+        <w:t xml:space="preserve">STEP </w:t>
+      </w:r>
+      <w:proofErr w:type="gramStart"/>
+      <w:r>
+        <w:t>4  /</w:t>
+      </w:r>
+      <w:proofErr w:type="gramEnd"/>
+      <w:r>
+        <w:t xml:space="preserve">auth/me + </w:t>
+      </w:r>
+      <w:proofErr w:type="spellStart"/>
+      <w:proofErr w:type="gramStart"/>
+      <w:r>
+        <w:t>main.go</w:t>
+      </w:r>
+      <w:proofErr w:type="spellEnd"/>
+      <w:proofErr w:type="gramEnd"/>
+    </w:p>
+    <w:p>
+      <w:r>
+        <w:t xml:space="preserve">STEP </w:t>
+      </w:r>
+      <w:proofErr w:type="gramStart"/>
+      <w:r>
+        <w:t>5  Root</w:t>
+      </w:r>
+      <w:proofErr w:type="gramEnd"/>
+      <w:r>
+        <w:t xml:space="preserve"> account</w:t>
+      </w:r>
+    </w:p>
+    <w:p>
+      <w:r>
+        <w:t xml:space="preserve">STEP </w:t>
+      </w:r>
+      <w:proofErr w:type="gramStart"/>
+      <w:r>
+        <w:t>6  Test</w:t>
+      </w:r>
+      <w:proofErr w:type="gramEnd"/>
+      <w:r>
+        <w:t xml:space="preserve"> roles</w:t>
+      </w:r>
+    </w:p>
+    <w:p>
+      <w:r>
+        <w:t xml:space="preserve">STEP </w:t>
+      </w:r>
+      <w:proofErr w:type="gramStart"/>
+      <w:r>
+        <w:t>7  Approval</w:t>
+      </w:r>
+      <w:proofErr w:type="gramEnd"/>
+      <w:r>
+        <w:t>/Delivery</w:t>
+      </w:r>
+    </w:p>
+    <w:p>
+      <w:r>
+        <w:t xml:space="preserve">The important part is that Step 1 will remain compatible with your existing admin login. Your existing tokens use "role" for </w:t>
+      </w:r>
+      <w:proofErr w:type="spellStart"/>
+      <w:r>
+        <w:t>UserType</w:t>
+      </w:r>
+      <w:proofErr w:type="spellEnd"/>
+      <w:r>
+        <w:t xml:space="preserve">, so we will </w:t>
+      </w:r>
+      <w:r>
+        <w:rPr>
+          <w:b/>
+          <w:bCs/>
+        </w:rPr>
+        <w:t>keep that claim unchanged</w:t>
+      </w:r>
+      <w:r>
+        <w:t xml:space="preserve"> and add </w:t>
+      </w:r>
+      <w:proofErr w:type="spellStart"/>
+      <w:r>
+        <w:t>role_code</w:t>
+      </w:r>
+      <w:proofErr w:type="spellEnd"/>
+      <w:r>
+        <w:t xml:space="preserve"> separately.</w:t>
+      </w:r>
+    </w:p>
+    <w:p>
+      <w:pPr>
+        <w:rPr>
+          <w:b/>
+          <w:bCs/>
+        </w:rPr>
+      </w:pPr>
+      <w:r>
+        <w:rPr>
+          <w:b/>
+          <w:bCs/>
+        </w:rPr>
+        <w:t>Step 1 — Back up the current middleware file</w:t>
+      </w:r>
+    </w:p>
+    <w:p>
+      <w:r>
+        <w:t>From:</w:t>
+      </w:r>
+    </w:p>
+    <w:p>
+      <w:r>
+        <w:t>cd D:\ITM-Data\itm\backend</w:t>
+      </w:r>
+    </w:p>
+    <w:p>
+      <w:r>
+        <w:t>run:</w:t>
+      </w:r>
+    </w:p>
+    <w:p>
+      <w:r>
+        <w:t>Copy-Item `</w:t>
+      </w:r>
+    </w:p>
+    <w:p>
+      <w:r>
+        <w:t xml:space="preserve">  </w:t>
+      </w:r>
+      <w:proofErr w:type="gramStart"/>
+      <w:r>
+        <w:t>".\internal\middleware\</w:t>
+      </w:r>
+      <w:proofErr w:type="spellStart"/>
+      <w:r>
+        <w:t>middleware.go</w:t>
+      </w:r>
+      <w:proofErr w:type="spellEnd"/>
+      <w:proofErr w:type="gramEnd"/>
+      <w:r>
+        <w:t>" `</w:t>
+      </w:r>
+    </w:p>
+    <w:p>
+      <w:r>
+        <w:t xml:space="preserve">  ".\internal\middleware\</w:t>
+      </w:r>
+      <w:proofErr w:type="spellStart"/>
+      <w:r>
+        <w:t>middleware.go.before</w:t>
+      </w:r>
+      <w:proofErr w:type="spellEnd"/>
+      <w:r>
+        <w:t>-professional-auth"</w:t>
+      </w:r>
+    </w:p>
+    <w:p>
+      <w:r>
+        <w:t>Then confirm:</w:t>
+      </w:r>
+    </w:p>
+    <w:p>
+      <w:r>
+        <w:t>Get-Item ".\internal\middleware\</w:t>
+      </w:r>
+      <w:proofErr w:type="spellStart"/>
+      <w:r>
+        <w:t>middleware.go.before</w:t>
+      </w:r>
+      <w:proofErr w:type="spellEnd"/>
+      <w:r>
+        <w:t>-professional-auth"</w:t>
+      </w:r>
+    </w:p>
+    <w:p>
+      <w:r>
+        <w:pict w14:anchorId="2342938A">
+          <v:rect id="_x0000_i1068" style="width:0;height:1.5pt" o:hralign="center" o:hrstd="t" o:hr="t" fillcolor="#a0a0a0" stroked="f"/>
+        </w:pict>
+      </w:r>
+    </w:p>
+    <w:p>
+      <w:pPr>
+        <w:rPr>
+          <w:b/>
+          <w:bCs/>
+        </w:rPr>
+      </w:pPr>
+      <w:r>
+        <w:rPr>
+          <w:b/>
+          <w:bCs/>
+        </w:rPr>
+        <w:t>Step 2 — Replace the complete middleware file</w:t>
+      </w:r>
+    </w:p>
+    <w:p>
+      <w:r>
+        <w:t>Replace the entire:</w:t>
+      </w:r>
+    </w:p>
+    <w:p>
+      <w:r>
+        <w:lastRenderedPageBreak/>
+        <w:t>backend/internal/middleware/</w:t>
+      </w:r>
+      <w:proofErr w:type="spellStart"/>
+      <w:proofErr w:type="gramStart"/>
+      <w:r>
+        <w:t>middleware.go</w:t>
+      </w:r>
+      <w:proofErr w:type="spellEnd"/>
+      <w:proofErr w:type="gramEnd"/>
+    </w:p>
+    <w:p>
+      <w:r>
+        <w:t>with this:</w:t>
+      </w:r>
+    </w:p>
+    <w:p>
+      <w:r>
+        <w:t>package middleware</w:t>
+      </w:r>
+    </w:p>
+    <w:p/>
+    <w:p>
+      <w:r>
+        <w:t>import (</w:t>
+      </w:r>
+    </w:p>
+    <w:p>
+      <w:r>
+        <w:tab/>
+        <w:t>"net/http"</w:t>
+      </w:r>
+    </w:p>
+    <w:p>
+      <w:r>
+        <w:tab/>
+        <w:t>"strings"</w:t>
+      </w:r>
+    </w:p>
+    <w:p>
+      <w:r>
+        <w:tab/>
+        <w:t>"sync"</w:t>
+      </w:r>
+    </w:p>
+    <w:p>
+      <w:r>
+        <w:tab/>
+        <w:t>"time"</w:t>
+      </w:r>
+    </w:p>
+    <w:p/>
+    <w:p>
+      <w:r>
+        <w:tab/>
+        <w:t>"github.com/gin-</w:t>
+      </w:r>
+      <w:proofErr w:type="spellStart"/>
+      <w:r>
+        <w:t>gonic</w:t>
+      </w:r>
+      <w:proofErr w:type="spellEnd"/>
+      <w:r>
+        <w:t>/gin"</w:t>
+      </w:r>
+    </w:p>
+    <w:p>
+      <w:r>
+        <w:tab/>
+        <w:t>"github.com/</w:t>
+      </w:r>
+      <w:proofErr w:type="spellStart"/>
+      <w:r>
+        <w:t>golang-jwt</w:t>
+      </w:r>
+      <w:proofErr w:type="spellEnd"/>
+      <w:r>
+        <w:t>/</w:t>
+      </w:r>
+      <w:proofErr w:type="spellStart"/>
+      <w:r>
+        <w:t>jwt</w:t>
+      </w:r>
+      <w:proofErr w:type="spellEnd"/>
+      <w:r>
+        <w:t>/v5"</w:t>
+      </w:r>
+    </w:p>
+    <w:p>
+      <w:r>
+        <w:tab/>
+        <w:t>"golang.org/x/time/rate"</w:t>
+      </w:r>
+    </w:p>
+    <w:p>
+      <w:r>
+        <w:t>)</w:t>
+      </w:r>
+    </w:p>
+    <w:p/>
+    <w:p>
+      <w:r>
+        <w:t>/* ============================================================</w:t>
+      </w:r>
+    </w:p>
+    <w:p>
+      <w:r>
+        <w:t xml:space="preserve">   AUTHENTICATION CONTEXT KEYS</w:t>
+      </w:r>
+    </w:p>
+    <w:p>
+      <w:r>
+        <w:t>============================================================ */</w:t>
+      </w:r>
+    </w:p>
+    <w:p/>
+    <w:p>
+      <w:r>
+        <w:t>const (</w:t>
+      </w:r>
+    </w:p>
+    <w:p>
+      <w:r>
+        <w:tab/>
+      </w:r>
+      <w:proofErr w:type="spellStart"/>
+      <w:r>
+        <w:t>ContextUserID</w:t>
+      </w:r>
+      <w:proofErr w:type="spellEnd"/>
+      <w:r>
+        <w:t xml:space="preserve">     = "</w:t>
+      </w:r>
+      <w:proofErr w:type="spellStart"/>
+      <w:r>
+        <w:t>user_id</w:t>
+      </w:r>
+      <w:proofErr w:type="spellEnd"/>
+      <w:r>
+        <w:t>"</w:t>
+      </w:r>
+    </w:p>
+    <w:p>
+      <w:r>
+        <w:tab/>
+      </w:r>
+      <w:proofErr w:type="spellStart"/>
+      <w:r>
+        <w:t>ContextEmployeeID</w:t>
+      </w:r>
+      <w:proofErr w:type="spellEnd"/>
+      <w:r>
+        <w:t xml:space="preserve"> = "</w:t>
+      </w:r>
+      <w:proofErr w:type="spellStart"/>
+      <w:r>
+        <w:t>employee_id</w:t>
+      </w:r>
+      <w:proofErr w:type="spellEnd"/>
+      <w:r>
+        <w:t>"</w:t>
+      </w:r>
+    </w:p>
+    <w:p>
+      <w:r>
+        <w:tab/>
+      </w:r>
+      <w:proofErr w:type="spellStart"/>
+      <w:r>
+        <w:t>ContextUsername</w:t>
+      </w:r>
+      <w:proofErr w:type="spellEnd"/>
+      <w:r>
+        <w:t xml:space="preserve">   = "username"</w:t>
+      </w:r>
+    </w:p>
+    <w:p>
+      <w:r>
+        <w:tab/>
+      </w:r>
+      <w:proofErr w:type="spellStart"/>
+      <w:r>
+        <w:t>ContextUserType</w:t>
+      </w:r>
+      <w:proofErr w:type="spellEnd"/>
+      <w:r>
+        <w:t xml:space="preserve">   = "</w:t>
+      </w:r>
+      <w:proofErr w:type="spellStart"/>
+      <w:r>
+        <w:t>user_type</w:t>
+      </w:r>
+      <w:proofErr w:type="spellEnd"/>
+      <w:r>
+        <w:t>"</w:t>
+      </w:r>
+    </w:p>
+    <w:p>
+      <w:r>
+        <w:tab/>
+      </w:r>
+      <w:proofErr w:type="spellStart"/>
+      <w:r>
+        <w:t>ContextRoleCode</w:t>
+      </w:r>
+      <w:proofErr w:type="spellEnd"/>
+      <w:r>
+        <w:t xml:space="preserve">   = "</w:t>
+      </w:r>
+      <w:proofErr w:type="spellStart"/>
+      <w:r>
+        <w:t>role_code</w:t>
+      </w:r>
+      <w:proofErr w:type="spellEnd"/>
+      <w:r>
+        <w:t>"</w:t>
+      </w:r>
+    </w:p>
+    <w:p>
+      <w:r>
+        <w:t>)</w:t>
+      </w:r>
+    </w:p>
+    <w:p/>
+    <w:p>
+      <w:r>
+        <w:t>/* ============================================================</w:t>
+      </w:r>
+    </w:p>
+    <w:p>
+      <w:r>
+        <w:t xml:space="preserve">   USER TYPE / ROLE CONSTANTS</w:t>
+      </w:r>
+    </w:p>
+    <w:p/>
+    <w:p>
+      <w:r>
+        <w:t xml:space="preserve">   0 = Root / Super Administrator</w:t>
+      </w:r>
+    </w:p>
+    <w:p>
+      <w:r>
+        <w:t xml:space="preserve">   1 = IT Administrator</w:t>
+      </w:r>
+    </w:p>
+    <w:p>
+      <w:r>
+        <w:t xml:space="preserve">   2 = IT Personnel</w:t>
+      </w:r>
+    </w:p>
+    <w:p>
+      <w:r>
+        <w:t xml:space="preserve">   3 = General User</w:t>
+      </w:r>
+    </w:p>
+    <w:p>
+      <w:r>
+        <w:t>============================================================ */</w:t>
+      </w:r>
+    </w:p>
+    <w:p/>
+    <w:p>
+      <w:r>
+        <w:t>const (</w:t>
+      </w:r>
+    </w:p>
+    <w:p>
+      <w:r>
+        <w:tab/>
+      </w:r>
+      <w:proofErr w:type="spellStart"/>
+      <w:r>
+        <w:t>UserTypeRoot</w:t>
+      </w:r>
+      <w:proofErr w:type="spellEnd"/>
+      <w:r>
+        <w:t xml:space="preserve">        = 0</w:t>
+      </w:r>
+    </w:p>
+    <w:p>
+      <w:r>
+        <w:tab/>
+      </w:r>
+      <w:proofErr w:type="spellStart"/>
+      <w:r>
+        <w:t>UserTypeITAdmin</w:t>
+      </w:r>
+      <w:proofErr w:type="spellEnd"/>
+      <w:r>
+        <w:t xml:space="preserve">     = 1</w:t>
+      </w:r>
+    </w:p>
+    <w:p>
+      <w:r>
+        <w:tab/>
+      </w:r>
+      <w:proofErr w:type="spellStart"/>
+      <w:r>
+        <w:t>UserTypeITPersonnel</w:t>
+      </w:r>
+      <w:proofErr w:type="spellEnd"/>
+      <w:r>
+        <w:t xml:space="preserve"> = 2</w:t>
+      </w:r>
+    </w:p>
+    <w:p>
+      <w:r>
+        <w:tab/>
+      </w:r>
+      <w:proofErr w:type="spellStart"/>
+      <w:r>
+        <w:t>UserTypeGeneral</w:t>
+      </w:r>
+      <w:proofErr w:type="spellEnd"/>
+      <w:r>
+        <w:t xml:space="preserve">     = 3</w:t>
+      </w:r>
+    </w:p>
+    <w:p>
+      <w:r>
+        <w:t>)</w:t>
+      </w:r>
+    </w:p>
+    <w:p/>
+    <w:p>
+      <w:r>
+        <w:t>/* ============================================================</w:t>
+      </w:r>
+    </w:p>
+    <w:p>
+      <w:r>
+        <w:t xml:space="preserve">   JWT CLAIMS</w:t>
+      </w:r>
+    </w:p>
+    <w:p/>
+    <w:p>
+      <w:r>
+        <w:t xml:space="preserve">   IMPORTANT:</w:t>
+      </w:r>
+    </w:p>
+    <w:p>
+      <w:r>
+        <w:t xml:space="preserve">   </w:t>
+      </w:r>
+      <w:proofErr w:type="spellStart"/>
+      <w:r>
+        <w:t>UserType</w:t>
+      </w:r>
+      <w:proofErr w:type="spellEnd"/>
+      <w:r>
+        <w:t xml:space="preserve"> keeps </w:t>
+      </w:r>
+      <w:proofErr w:type="spellStart"/>
+      <w:r>
+        <w:t>json</w:t>
+      </w:r>
+      <w:proofErr w:type="spellEnd"/>
+      <w:r>
+        <w:t>:"role" for backward compatibility with</w:t>
+      </w:r>
+    </w:p>
+    <w:p>
+      <w:r>
+        <w:t xml:space="preserve">   the JWT tokens already generated by the current application.</w:t>
+      </w:r>
+    </w:p>
+    <w:p/>
+    <w:p>
+      <w:r>
+        <w:t xml:space="preserve">   </w:t>
+      </w:r>
+      <w:proofErr w:type="spellStart"/>
+      <w:r>
+        <w:t>RoleCode</w:t>
+      </w:r>
+      <w:proofErr w:type="spellEnd"/>
+      <w:r>
+        <w:t xml:space="preserve"> is new and will be populated after handler/</w:t>
+      </w:r>
+      <w:proofErr w:type="spellStart"/>
+      <w:proofErr w:type="gramStart"/>
+      <w:r>
+        <w:t>auth.go</w:t>
+      </w:r>
+      <w:proofErr w:type="spellEnd"/>
+      <w:proofErr w:type="gramEnd"/>
+    </w:p>
+    <w:p>
+      <w:r>
+        <w:t xml:space="preserve">   is upgraded in the next step.</w:t>
+      </w:r>
+    </w:p>
+    <w:p>
+      <w:r>
+        <w:lastRenderedPageBreak/>
+        <w:t>============================================================ */</w:t>
+      </w:r>
+    </w:p>
+    <w:p/>
+    <w:p>
+      <w:r>
+        <w:t>type Claims struct {</w:t>
+      </w:r>
+    </w:p>
+    <w:p>
+      <w:r>
+        <w:tab/>
+      </w:r>
+      <w:proofErr w:type="spellStart"/>
+      <w:r>
+        <w:t>UserID</w:t>
+      </w:r>
+      <w:proofErr w:type="spellEnd"/>
+      <w:r>
+        <w:t xml:space="preserve">     int    `</w:t>
+      </w:r>
+      <w:proofErr w:type="spellStart"/>
+      <w:r>
+        <w:t>json</w:t>
+      </w:r>
+      <w:proofErr w:type="spellEnd"/>
+      <w:r>
+        <w:t>:"</w:t>
+      </w:r>
+      <w:proofErr w:type="spellStart"/>
+      <w:r>
+        <w:t>uid</w:t>
+      </w:r>
+      <w:proofErr w:type="spellEnd"/>
+      <w:r>
+        <w:t>"`</w:t>
+      </w:r>
+    </w:p>
+    <w:p>
+      <w:r>
+        <w:tab/>
+      </w:r>
+      <w:proofErr w:type="spellStart"/>
+      <w:r>
+        <w:t>EmployeeID</w:t>
+      </w:r>
+      <w:proofErr w:type="spellEnd"/>
+      <w:r>
+        <w:t xml:space="preserve"> string `</w:t>
+      </w:r>
+      <w:proofErr w:type="spellStart"/>
+      <w:r>
+        <w:t>json</w:t>
+      </w:r>
+      <w:proofErr w:type="spellEnd"/>
+      <w:r>
+        <w:t>:"emp"`</w:t>
+      </w:r>
+    </w:p>
+    <w:p>
+      <w:r>
+        <w:tab/>
+        <w:t>Username   string `</w:t>
+      </w:r>
+      <w:proofErr w:type="spellStart"/>
+      <w:r>
+        <w:t>json</w:t>
+      </w:r>
+      <w:proofErr w:type="spellEnd"/>
+      <w:r>
+        <w:t>:"</w:t>
+      </w:r>
+      <w:proofErr w:type="spellStart"/>
+      <w:r>
+        <w:t>uname</w:t>
+      </w:r>
+      <w:proofErr w:type="spellEnd"/>
+      <w:r>
+        <w:t>"`</w:t>
+      </w:r>
+    </w:p>
+    <w:p>
+      <w:r>
+        <w:tab/>
+      </w:r>
+      <w:proofErr w:type="spellStart"/>
+      <w:r>
+        <w:t>UserType</w:t>
+      </w:r>
+      <w:proofErr w:type="spellEnd"/>
+      <w:r>
+        <w:t xml:space="preserve">   int    `</w:t>
+      </w:r>
+      <w:proofErr w:type="spellStart"/>
+      <w:r>
+        <w:t>json</w:t>
+      </w:r>
+      <w:proofErr w:type="spellEnd"/>
+      <w:r>
+        <w:t>:"role"`</w:t>
+      </w:r>
+    </w:p>
+    <w:p>
+      <w:r>
+        <w:tab/>
+      </w:r>
+      <w:proofErr w:type="spellStart"/>
+      <w:r>
+        <w:t>RoleCode</w:t>
+      </w:r>
+      <w:proofErr w:type="spellEnd"/>
+      <w:r>
+        <w:t xml:space="preserve">   string `</w:t>
+      </w:r>
+      <w:proofErr w:type="spellStart"/>
+      <w:r>
+        <w:t>json</w:t>
+      </w:r>
+      <w:proofErr w:type="spellEnd"/>
+      <w:r>
+        <w:t>:"</w:t>
+      </w:r>
+      <w:proofErr w:type="spellStart"/>
+      <w:r>
+        <w:t>role_</w:t>
+      </w:r>
+      <w:proofErr w:type="gramStart"/>
+      <w:r>
+        <w:t>code,omitempty</w:t>
+      </w:r>
+      <w:proofErr w:type="spellEnd"/>
+      <w:proofErr w:type="gramEnd"/>
+      <w:r>
+        <w:t>"`</w:t>
+      </w:r>
+    </w:p>
+    <w:p/>
+    <w:p>
+      <w:r>
+        <w:tab/>
+      </w:r>
+      <w:proofErr w:type="spellStart"/>
+      <w:proofErr w:type="gramStart"/>
+      <w:r>
+        <w:t>jwt.RegisteredClaims</w:t>
+      </w:r>
+      <w:proofErr w:type="spellEnd"/>
+      <w:proofErr w:type="gramEnd"/>
+    </w:p>
+    <w:p>
+      <w:r>
+        <w:t>}</w:t>
+      </w:r>
+    </w:p>
+    <w:p/>
+    <w:p>
+      <w:r>
+        <w:t>/* ============================================================</w:t>
+      </w:r>
+    </w:p>
+    <w:p>
+      <w:r>
+        <w:t xml:space="preserve">   AUTH MIDDLEWARE</w:t>
+      </w:r>
+    </w:p>
+    <w:p>
+      <w:r>
+        <w:t>============================================================ */</w:t>
+      </w:r>
+    </w:p>
+    <w:p/>
+    <w:p>
+      <w:proofErr w:type="spellStart"/>
+      <w:r>
+        <w:t>func</w:t>
+      </w:r>
+      <w:proofErr w:type="spellEnd"/>
+      <w:r>
+        <w:t xml:space="preserve"> </w:t>
+      </w:r>
+      <w:proofErr w:type="gramStart"/>
+      <w:r>
+        <w:t>Auth(</w:t>
+      </w:r>
+      <w:proofErr w:type="gramEnd"/>
+      <w:r>
+        <w:t xml:space="preserve">secret string) </w:t>
+      </w:r>
+      <w:proofErr w:type="spellStart"/>
+      <w:proofErr w:type="gramStart"/>
+      <w:r>
+        <w:t>gin.HandlerFunc</w:t>
+      </w:r>
+      <w:proofErr w:type="spellEnd"/>
+      <w:proofErr w:type="gramEnd"/>
+      <w:r>
+        <w:t xml:space="preserve"> {</w:t>
+      </w:r>
+    </w:p>
+    <w:p>
+      <w:r>
+        <w:tab/>
+        <w:t xml:space="preserve">secret = </w:t>
+      </w:r>
+      <w:proofErr w:type="spellStart"/>
+      <w:proofErr w:type="gramStart"/>
+      <w:r>
+        <w:t>strings.TrimSpace</w:t>
+      </w:r>
+      <w:proofErr w:type="spellEnd"/>
+      <w:proofErr w:type="gramEnd"/>
+      <w:r>
+        <w:t>(secret)</w:t>
+      </w:r>
+    </w:p>
+    <w:p/>
+    <w:p>
+      <w:r>
+        <w:tab/>
+        <w:t xml:space="preserve">return </w:t>
+      </w:r>
+      <w:proofErr w:type="spellStart"/>
+      <w:proofErr w:type="gramStart"/>
+      <w:r>
+        <w:t>func</w:t>
+      </w:r>
+      <w:proofErr w:type="spellEnd"/>
+      <w:r>
+        <w:t>(</w:t>
+      </w:r>
+      <w:proofErr w:type="gramEnd"/>
+      <w:r>
+        <w:t>c *</w:t>
+      </w:r>
+      <w:proofErr w:type="spellStart"/>
+      <w:proofErr w:type="gramStart"/>
+      <w:r>
+        <w:t>gin.Context</w:t>
+      </w:r>
+      <w:proofErr w:type="spellEnd"/>
+      <w:proofErr w:type="gramEnd"/>
+      <w:r>
+        <w:t>) {</w:t>
+      </w:r>
+    </w:p>
+    <w:p>
+      <w:r>
+        <w:tab/>
+      </w:r>
+      <w:r>
+        <w:tab/>
+        <w:t xml:space="preserve">if secret == </w:t>
+      </w:r>
+      <w:proofErr w:type="gramStart"/>
+      <w:r>
+        <w:t>"" {</w:t>
+      </w:r>
+      <w:proofErr w:type="gramEnd"/>
+    </w:p>
+    <w:p>
+      <w:r>
+        <w:tab/>
+      </w:r>
+      <w:r>
+        <w:tab/>
+      </w:r>
+      <w:r>
+        <w:tab/>
+      </w:r>
+      <w:proofErr w:type="spellStart"/>
+      <w:r>
+        <w:t>c.</w:t>
+      </w:r>
+      <w:proofErr w:type="gramStart"/>
+      <w:r>
+        <w:t>AbortWithStatusJSON</w:t>
+      </w:r>
+      <w:proofErr w:type="spellEnd"/>
+      <w:r>
+        <w:t>(</w:t>
+      </w:r>
+      <w:proofErr w:type="gramEnd"/>
+    </w:p>
+    <w:p>
+      <w:r>
+        <w:tab/>
+      </w:r>
+      <w:r>
+        <w:tab/>
+      </w:r>
+      <w:r>
+        <w:tab/>
+      </w:r>
+      <w:r>
+        <w:tab/>
+      </w:r>
+      <w:proofErr w:type="spellStart"/>
+      <w:proofErr w:type="gramStart"/>
+      <w:r>
+        <w:t>http.StatusInternalServerError</w:t>
+      </w:r>
+      <w:proofErr w:type="spellEnd"/>
+      <w:proofErr w:type="gramEnd"/>
+      <w:r>
+        <w:t>,</w:t>
+      </w:r>
+    </w:p>
+    <w:p>
+      <w:r>
+        <w:tab/>
+      </w:r>
+      <w:r>
+        <w:tab/>
+      </w:r>
+      <w:r>
+        <w:tab/>
+      </w:r>
+      <w:r>
+        <w:tab/>
+      </w:r>
+      <w:proofErr w:type="spellStart"/>
+      <w:r>
+        <w:t>gin.</w:t>
+      </w:r>
+      <w:proofErr w:type="gramStart"/>
+      <w:r>
+        <w:t>H</w:t>
+      </w:r>
+      <w:proofErr w:type="spellEnd"/>
+      <w:r>
+        <w:t>{</w:t>
+      </w:r>
+      <w:proofErr w:type="gramEnd"/>
+    </w:p>
+    <w:p>
+      <w:r>
+        <w:tab/>
+      </w:r>
+      <w:r>
+        <w:tab/>
+      </w:r>
+      <w:r>
+        <w:tab/>
+      </w:r>
+      <w:r>
+        <w:tab/>
+      </w:r>
+      <w:r>
+        <w:tab/>
+        <w:t>"success": false,</w:t>
+      </w:r>
+    </w:p>
+    <w:p>
+      <w:r>
+        <w:tab/>
+      </w:r>
+      <w:r>
+        <w:tab/>
+      </w:r>
+      <w:r>
+        <w:tab/>
+      </w:r>
+      <w:r>
+        <w:tab/>
+      </w:r>
+      <w:r>
+        <w:tab/>
+        <w:t>"error":   "authentication configuration error",</w:t>
+      </w:r>
+    </w:p>
+    <w:p>
+      <w:r>
+        <w:lastRenderedPageBreak/>
+        <w:tab/>
+      </w:r>
+      <w:r>
+        <w:tab/>
+      </w:r>
+      <w:r>
+        <w:tab/>
+      </w:r>
+      <w:r>
+        <w:tab/>
+        <w:t>},</w:t>
+      </w:r>
+    </w:p>
+    <w:p>
+      <w:r>
+        <w:tab/>
+      </w:r>
+      <w:r>
+        <w:tab/>
+      </w:r>
+      <w:r>
+        <w:tab/>
+        <w:t>)</w:t>
+      </w:r>
+    </w:p>
+    <w:p>
+      <w:r>
+        <w:tab/>
+      </w:r>
+      <w:r>
+        <w:tab/>
+      </w:r>
+      <w:r>
+        <w:tab/>
+        <w:t>return</w:t>
+      </w:r>
+    </w:p>
+    <w:p>
+      <w:r>
+        <w:tab/>
+      </w:r>
+      <w:r>
+        <w:tab/>
+        <w:t>}</w:t>
+      </w:r>
+    </w:p>
+    <w:p/>
+    <w:p>
+      <w:r>
+        <w:tab/>
+      </w:r>
+      <w:r>
+        <w:tab/>
+      </w:r>
+      <w:proofErr w:type="spellStart"/>
+      <w:proofErr w:type="gramStart"/>
+      <w:r>
+        <w:t>authHeader</w:t>
+      </w:r>
+      <w:proofErr w:type="spellEnd"/>
+      <w:r>
+        <w:t xml:space="preserve"> :</w:t>
+      </w:r>
+      <w:proofErr w:type="gramEnd"/>
+      <w:r>
+        <w:t xml:space="preserve">= </w:t>
+      </w:r>
+      <w:proofErr w:type="spellStart"/>
+      <w:proofErr w:type="gramStart"/>
+      <w:r>
+        <w:t>strings.TrimSpace</w:t>
+      </w:r>
+      <w:proofErr w:type="spellEnd"/>
+      <w:proofErr w:type="gramEnd"/>
+      <w:r>
+        <w:t>(</w:t>
+      </w:r>
+    </w:p>
+    <w:p>
+      <w:pPr>
+        <w:rPr>
+          <w:b/>
+          <w:bCs/>
+        </w:rPr>
+      </w:pPr>
+      <w:r>
+        <w:rPr>
+          <w:b/>
+          <w:bCs/>
+        </w:rPr>
+        <w:t>Step 3 — Format it</w:t>
+      </w:r>
+    </w:p>
+    <w:p>
+      <w:r>
+        <w:t>Run:</w:t>
+      </w:r>
+    </w:p>
+    <w:p>
+      <w:r>
+        <w:t>cd D:\ITM-Data\itm\backend</w:t>
+      </w:r>
+    </w:p>
+    <w:p/>
+    <w:p>
+      <w:proofErr w:type="spellStart"/>
+      <w:r>
+        <w:t>gofmt</w:t>
+      </w:r>
+      <w:proofErr w:type="spellEnd"/>
+      <w:r>
+        <w:t xml:space="preserve"> -</w:t>
+      </w:r>
+      <w:proofErr w:type="gramStart"/>
+      <w:r>
+        <w:t>w .</w:t>
+      </w:r>
+      <w:proofErr w:type="gramEnd"/>
+      <w:r>
+        <w:t>\internal\middleware\</w:t>
+      </w:r>
+      <w:proofErr w:type="spellStart"/>
+      <w:r>
+        <w:t>middleware.go</w:t>
+      </w:r>
+      <w:proofErr w:type="spellEnd"/>
+    </w:p>
+    <w:p>
+      <w:r>
+        <w:t>Then:</w:t>
+      </w:r>
+    </w:p>
+    <w:p>
+      <w:r>
+        <w:t xml:space="preserve">go </w:t>
+      </w:r>
+      <w:proofErr w:type="spellStart"/>
+      <w:proofErr w:type="gramStart"/>
+      <w:r>
+        <w:t>test</w:t>
+      </w:r>
+      <w:proofErr w:type="spellEnd"/>
+      <w:r>
+        <w:t xml:space="preserve"> .</w:t>
+      </w:r>
+      <w:proofErr w:type="gramEnd"/>
+      <w:r>
+        <w:t>/...</w:t>
+      </w:r>
+    </w:p>
+    <w:p>
+      <w:r>
+        <w:t xml:space="preserve">If you have packages without tests, that's okay. What matters is that there are </w:t>
+      </w:r>
+      <w:r>
+        <w:rPr>
+          <w:b/>
+          <w:bCs/>
+        </w:rPr>
+        <w:t>no compilation errors</w:t>
+      </w:r>
+      <w:r>
+        <w:t>.</w:t>
+      </w:r>
+    </w:p>
+    <w:p>
+      <w:r>
+        <w:t>If there is an error, don't change anything else. Send me the exact output.</w:t>
+      </w:r>
+    </w:p>
+    <w:p>
+      <w:r>
+        <w:pict w14:anchorId="4C22DEF0">
+          <v:rect id="_x0000_i1069" style="width:0;height:1.5pt" o:hralign="center" o:hrstd="t" o:hr="t" fillcolor="#a0a0a0" stroked="f"/>
+        </w:pict>
+      </w:r>
+    </w:p>
+    <w:p>
+      <w:pPr>
+        <w:rPr>
+          <w:b/>
+          <w:bCs/>
+        </w:rPr>
+      </w:pPr>
+      <w:r>
+        <w:rPr>
+          <w:b/>
+          <w:bCs/>
+        </w:rPr>
+        <w:t>Step 4 — Start the backend</w:t>
+      </w:r>
+    </w:p>
+    <w:p>
+      <w:r>
+        <w:t>Use your normal method.</w:t>
+      </w:r>
+    </w:p>
+    <w:p>
+      <w:r>
+        <w:t>If you use air:</w:t>
+      </w:r>
+    </w:p>
+    <w:p>
+      <w:r>
+        <w:t>air</w:t>
+      </w:r>
+    </w:p>
+    <w:p>
+      <w:r>
+        <w:t>or:</w:t>
+      </w:r>
+    </w:p>
+    <w:p>
+      <w:r>
+        <w:t xml:space="preserve">go </w:t>
+      </w:r>
+      <w:proofErr w:type="gramStart"/>
+      <w:r>
+        <w:t>run .</w:t>
+      </w:r>
+      <w:proofErr w:type="gramEnd"/>
+      <w:r>
+        <w:t>/</w:t>
+      </w:r>
+      <w:proofErr w:type="spellStart"/>
+      <w:r>
+        <w:t>cmd</w:t>
+      </w:r>
+      <w:proofErr w:type="spellEnd"/>
+      <w:r>
+        <w:t>/server</w:t>
+      </w:r>
+    </w:p>
+    <w:p>
+      <w:r>
+        <w:t xml:space="preserve">We are </w:t>
+      </w:r>
+      <w:r>
+        <w:rPr>
+          <w:b/>
+          <w:bCs/>
+        </w:rPr>
+        <w:t xml:space="preserve">not changing </w:t>
+      </w:r>
+      <w:proofErr w:type="spellStart"/>
+      <w:proofErr w:type="gramStart"/>
+      <w:r>
+        <w:rPr>
+          <w:b/>
+          <w:bCs/>
+        </w:rPr>
+        <w:t>main.go</w:t>
+      </w:r>
+      <w:proofErr w:type="spellEnd"/>
+      <w:proofErr w:type="gramEnd"/>
+      <w:r>
+        <w:rPr>
+          <w:b/>
+          <w:bCs/>
+        </w:rPr>
+        <w:t xml:space="preserve"> yet</w:t>
+      </w:r>
+      <w:r>
+        <w:t>.</w:t>
+      </w:r>
+    </w:p>
+    <w:p>
+      <w:r>
+        <w:t>Your current line remains correct:</w:t>
+      </w:r>
+    </w:p>
+    <w:p>
+      <w:proofErr w:type="spellStart"/>
+      <w:proofErr w:type="gramStart"/>
+      <w:r>
+        <w:t>p.Use</w:t>
+      </w:r>
+      <w:proofErr w:type="spellEnd"/>
+      <w:proofErr w:type="gramEnd"/>
+      <w:r>
+        <w:t>(</w:t>
+      </w:r>
+      <w:proofErr w:type="spellStart"/>
+      <w:proofErr w:type="gramStart"/>
+      <w:r>
+        <w:t>middleware.Auth</w:t>
+      </w:r>
+      <w:proofErr w:type="spellEnd"/>
+      <w:proofErr w:type="gramEnd"/>
+      <w:r>
+        <w:t>(</w:t>
+      </w:r>
+      <w:proofErr w:type="spellStart"/>
+      <w:proofErr w:type="gramStart"/>
+      <w:r>
+        <w:t>cfg.JWTSecret</w:t>
+      </w:r>
+      <w:proofErr w:type="spellEnd"/>
+      <w:proofErr w:type="gramEnd"/>
+      <w:r>
+        <w:t>))</w:t>
+      </w:r>
+    </w:p>
+    <w:p>
+      <w:r>
+        <w:lastRenderedPageBreak/>
+        <w:pict w14:anchorId="70CF73CD">
+          <v:rect id="_x0000_i1070" style="width:0;height:1.5pt" o:hralign="center" o:hrstd="t" o:hr="t" fillcolor="#a0a0a0" stroked="f"/>
+        </w:pict>
+      </w:r>
+    </w:p>
+    <w:p>
+      <w:pPr>
+        <w:rPr>
+          <w:b/>
+          <w:bCs/>
+        </w:rPr>
+      </w:pPr>
+      <w:r>
+        <w:rPr>
+          <w:b/>
+          <w:bCs/>
+        </w:rPr>
+        <w:t>Step 5 — Test current demo login</w:t>
+      </w:r>
+    </w:p>
+    <w:p>
+      <w:r>
+        <w:t>Use the existing demo admin account.</w:t>
+      </w:r>
+    </w:p>
+    <w:p>
+      <w:r>
+        <w:t>Request:</w:t>
+      </w:r>
+    </w:p>
+    <w:p>
+      <w:r>
+        <w:t>POST /</w:t>
+      </w:r>
+      <w:proofErr w:type="spellStart"/>
+      <w:r>
+        <w:t>api</w:t>
+      </w:r>
+      <w:proofErr w:type="spellEnd"/>
+      <w:r>
+        <w:t>/v1/auth/login</w:t>
+      </w:r>
+    </w:p>
+    <w:p>
+      <w:r>
+        <w:t>Content-Type: application/</w:t>
+      </w:r>
+      <w:proofErr w:type="spellStart"/>
+      <w:r>
+        <w:t>json</w:t>
+      </w:r>
+      <w:proofErr w:type="spellEnd"/>
+    </w:p>
+    <w:p>
+      <w:r>
+        <w:t>Body:</w:t>
+      </w:r>
+    </w:p>
+    <w:p>
+      <w:r>
+        <w:t>{</w:t>
+      </w:r>
+    </w:p>
+    <w:p>
+      <w:r>
+        <w:t xml:space="preserve">    "username": "admin",</w:t>
+      </w:r>
+    </w:p>
+    <w:p>
+      <w:r>
+        <w:t xml:space="preserve">    "password": "YOUR_CURRENT_DEMO_PASSWORD"</w:t>
+      </w:r>
+    </w:p>
+    <w:p>
+      <w:r>
+        <w:t>}</w:t>
+      </w:r>
+    </w:p>
+    <w:p>
+      <w:r>
+        <w:t>We want the current login to continue returning:</w:t>
+      </w:r>
+    </w:p>
+    <w:p>
+      <w:r>
+        <w:t>{</w:t>
+      </w:r>
+    </w:p>
+    <w:p>
+      <w:r>
+        <w:t xml:space="preserve">    "success": true,</w:t>
+      </w:r>
+    </w:p>
+    <w:p>
+      <w:r>
+        <w:t xml:space="preserve">    "data</w:t>
+      </w:r>
+      <w:proofErr w:type="gramStart"/>
+      <w:r>
+        <w:t>": {</w:t>
+      </w:r>
+      <w:proofErr w:type="gramEnd"/>
+    </w:p>
+    <w:p>
+      <w:r>
+        <w:t xml:space="preserve">        "token": "...",</w:t>
+      </w:r>
+    </w:p>
+    <w:p>
+      <w:r>
+        <w:t xml:space="preserve">        "</w:t>
+      </w:r>
+      <w:proofErr w:type="spellStart"/>
+      <w:proofErr w:type="gramStart"/>
+      <w:r>
+        <w:t>expires</w:t>
+      </w:r>
+      <w:proofErr w:type="gramEnd"/>
+      <w:r>
+        <w:t>_in</w:t>
+      </w:r>
+      <w:proofErr w:type="spellEnd"/>
+      <w:r>
+        <w:t>": 28800,</w:t>
+      </w:r>
+    </w:p>
+    <w:p>
+      <w:r>
+        <w:t xml:space="preserve">        "</w:t>
+      </w:r>
+      <w:proofErr w:type="spellStart"/>
+      <w:proofErr w:type="gramStart"/>
+      <w:r>
+        <w:t>user</w:t>
+      </w:r>
+      <w:proofErr w:type="gramEnd"/>
+      <w:r>
+        <w:t>_id</w:t>
+      </w:r>
+      <w:proofErr w:type="spellEnd"/>
+      <w:r>
+        <w:t>": 1,</w:t>
+      </w:r>
+    </w:p>
+    <w:p>
+      <w:r>
+        <w:t xml:space="preserve">        "</w:t>
+      </w:r>
+      <w:proofErr w:type="spellStart"/>
+      <w:proofErr w:type="gramStart"/>
+      <w:r>
+        <w:t>employee</w:t>
+      </w:r>
+      <w:proofErr w:type="gramEnd"/>
+      <w:r>
+        <w:t>_id</w:t>
+      </w:r>
+      <w:proofErr w:type="spellEnd"/>
+      <w:r>
+        <w:t>": "ADMIN-001",</w:t>
+      </w:r>
+    </w:p>
+    <w:p>
+      <w:r>
+        <w:t xml:space="preserve">        "username": "admin",</w:t>
+      </w:r>
+    </w:p>
+    <w:p>
+      <w:r>
+        <w:t xml:space="preserve">        "</w:t>
+      </w:r>
+      <w:proofErr w:type="spellStart"/>
+      <w:proofErr w:type="gramStart"/>
+      <w:r>
+        <w:t>full</w:t>
+      </w:r>
+      <w:proofErr w:type="gramEnd"/>
+      <w:r>
+        <w:t>_name</w:t>
+      </w:r>
+      <w:proofErr w:type="spellEnd"/>
+      <w:r>
+        <w:t>": "System Administrator",</w:t>
+      </w:r>
+    </w:p>
+    <w:p>
+      <w:r>
+        <w:t xml:space="preserve">        "</w:t>
+      </w:r>
+      <w:proofErr w:type="spellStart"/>
+      <w:proofErr w:type="gramStart"/>
+      <w:r>
+        <w:t>user</w:t>
+      </w:r>
+      <w:proofErr w:type="gramEnd"/>
+      <w:r>
+        <w:t>_type</w:t>
+      </w:r>
+      <w:proofErr w:type="spellEnd"/>
+      <w:r>
+        <w:t>": 1</w:t>
+      </w:r>
+    </w:p>
+    <w:p>
+      <w:r>
+        <w:t xml:space="preserve">    }</w:t>
+      </w:r>
+    </w:p>
+    <w:p>
+      <w:r>
+        <w:t>}</w:t>
+      </w:r>
+    </w:p>
+    <w:p>
+      <w:proofErr w:type="spellStart"/>
+      <w:r>
+        <w:t>role_code</w:t>
+      </w:r>
+      <w:proofErr w:type="spellEnd"/>
+      <w:r>
+        <w:t xml:space="preserve"> will </w:t>
+      </w:r>
+      <w:r>
+        <w:rPr>
+          <w:b/>
+          <w:bCs/>
+        </w:rPr>
+        <w:t>not exist yet</w:t>
+      </w:r>
+      <w:r>
+        <w:t>. That's expected because we haven't updated handler/</w:t>
+      </w:r>
+      <w:proofErr w:type="spellStart"/>
+      <w:r>
+        <w:t>auth.go</w:t>
+      </w:r>
+      <w:proofErr w:type="spellEnd"/>
+      <w:r>
+        <w:t>.</w:t>
+      </w:r>
+    </w:p>
+    <w:p>
+      <w:r>
+        <w:pict w14:anchorId="619A7EC6">
+          <v:rect id="_x0000_i1071" style="width:0;height:1.5pt" o:hralign="center" o:hrstd="t" o:hr="t" fillcolor="#a0a0a0" stroked="f"/>
+        </w:pict>
+      </w:r>
+    </w:p>
+    <w:p>
+      <w:pPr>
+        <w:rPr>
+          <w:b/>
+          <w:bCs/>
+        </w:rPr>
+      </w:pPr>
+      <w:r>
+        <w:rPr>
+          <w:b/>
+          <w:bCs/>
+        </w:rPr>
+        <w:lastRenderedPageBreak/>
+        <w:t>Step 6 — Test a protected API</w:t>
+      </w:r>
+    </w:p>
+    <w:p>
+      <w:r>
+        <w:t>Copy the returned token.</w:t>
+      </w:r>
+    </w:p>
+    <w:p>
+      <w:r>
+        <w:t>Call one of your existing protected endpoints:</w:t>
+      </w:r>
+    </w:p>
+    <w:p>
+      <w:r>
+        <w:t>GET /</w:t>
+      </w:r>
+      <w:proofErr w:type="spellStart"/>
+      <w:r>
+        <w:t>api</w:t>
+      </w:r>
+      <w:proofErr w:type="spellEnd"/>
+      <w:r>
+        <w:t>/v1/dashboard/requisition-dashboard-summary</w:t>
+      </w:r>
+    </w:p>
+    <w:p>
+      <w:r>
+        <w:t>Authorization: Bearer YOUR_TOKEN</w:t>
+      </w:r>
+    </w:p>
+    <w:p>
+      <w:r>
+        <w:t xml:space="preserve">It should </w:t>
+      </w:r>
+      <w:proofErr w:type="gramStart"/>
+      <w:r>
+        <w:t>return</w:t>
+      </w:r>
+      <w:proofErr w:type="gramEnd"/>
+      <w:r>
+        <w:t>:</w:t>
+      </w:r>
+    </w:p>
+    <w:p>
+      <w:r>
+        <w:t>200 OK</w:t>
+      </w:r>
+    </w:p>
+    <w:p>
+      <w:r>
+        <w:t>That proves:</w:t>
+      </w:r>
+    </w:p>
+    <w:p>
+      <w:r>
+        <w:t>login</w:t>
+      </w:r>
+    </w:p>
+    <w:p>
+      <w:r>
+        <w:t xml:space="preserve">  ↓</w:t>
+      </w:r>
+    </w:p>
+    <w:p>
+      <w:r>
+        <w:t>JWT created</w:t>
+      </w:r>
+    </w:p>
+    <w:p>
+      <w:r>
+        <w:t xml:space="preserve">  ↓</w:t>
+      </w:r>
+    </w:p>
+    <w:p>
+      <w:proofErr w:type="spellStart"/>
+      <w:proofErr w:type="gramStart"/>
+      <w:r>
+        <w:t>middleware.Auth</w:t>
+      </w:r>
+      <w:proofErr w:type="spellEnd"/>
+      <w:proofErr w:type="gramEnd"/>
+    </w:p>
+    <w:p>
+      <w:r>
+        <w:t xml:space="preserve">  ↓</w:t>
+      </w:r>
+    </w:p>
+    <w:p>
+      <w:r>
+        <w:t>JWT validated</w:t>
+      </w:r>
+    </w:p>
+    <w:p>
+      <w:r>
+        <w:t xml:space="preserve">  ↓</w:t>
+      </w:r>
+    </w:p>
+    <w:p>
+      <w:r>
+        <w:t>protected API works</w:t>
+      </w:r>
+    </w:p>
+    <w:p>
+      <w:r>
+        <w:pict w14:anchorId="7EFE6325">
+          <v:rect id="_x0000_i1072" style="width:0;height:1.5pt" o:hralign="center" o:hrstd="t" o:hr="t" fillcolor="#a0a0a0" stroked="f"/>
+        </w:pict>
+      </w:r>
+    </w:p>
+    <w:p>
+      <w:pPr>
+        <w:rPr>
+          <w:b/>
+          <w:bCs/>
+        </w:rPr>
+      </w:pPr>
+      <w:r>
+        <w:rPr>
+          <w:b/>
+          <w:bCs/>
+        </w:rPr>
+        <w:t>Step 7 — Test missing token</w:t>
+      </w:r>
+    </w:p>
+    <w:p>
+      <w:r>
+        <w:t>Call the same endpoint without Authorization.</w:t>
+      </w:r>
+    </w:p>
+    <w:p>
+      <w:r>
+        <w:t>Expected:</w:t>
+      </w:r>
+    </w:p>
+    <w:p>
+      <w:r>
+        <w:t>401 Unauthorized</w:t>
+      </w:r>
+    </w:p>
+    <w:p>
+      <w:r>
+        <w:t>with:</w:t>
+      </w:r>
+    </w:p>
+    <w:p>
+      <w:r>
+        <w:t>{</w:t>
+      </w:r>
+    </w:p>
+    <w:p>
+      <w:r>
+        <w:t xml:space="preserve">    "success": false,</w:t>
+      </w:r>
+    </w:p>
+    <w:p>
+      <w:r>
+        <w:t xml:space="preserve">    "error": "missing or invalid authorization token"</w:t>
+      </w:r>
+    </w:p>
+    <w:p>
+      <w:r>
+        <w:lastRenderedPageBreak/>
+        <w:t>}</w:t>
+      </w:r>
+    </w:p>
+    <w:p>
+      <w:r>
+        <w:pict w14:anchorId="002E6DE5">
+          <v:rect id="_x0000_i1073" style="width:0;height:1.5pt" o:hralign="center" o:hrstd="t" o:hr="t" fillcolor="#a0a0a0" stroked="f"/>
+        </w:pict>
+      </w:r>
+    </w:p>
+    <w:p>
+      <w:pPr>
+        <w:rPr>
+          <w:b/>
+          <w:bCs/>
+        </w:rPr>
+      </w:pPr>
+      <w:r>
+        <w:rPr>
+          <w:b/>
+          <w:bCs/>
+        </w:rPr>
+        <w:t>Step 8 — Test invalid token</w:t>
+      </w:r>
+    </w:p>
+    <w:p>
+      <w:r>
+        <w:t>Use:</w:t>
+      </w:r>
+    </w:p>
+    <w:p>
+      <w:r>
+        <w:t>Authorization: Bearer abc123</w:t>
+      </w:r>
+    </w:p>
+    <w:p>
+      <w:r>
+        <w:t>Expected:</w:t>
+      </w:r>
+    </w:p>
+    <w:p>
+      <w:r>
+        <w:t>401 Unauthorized</w:t>
+      </w:r>
+    </w:p>
+    <w:p>
+      <w:r>
+        <w:t>with:</w:t>
+      </w:r>
+    </w:p>
+    <w:p>
+      <w:r>
+        <w:t>{</w:t>
+      </w:r>
+    </w:p>
+    <w:p>
+      <w:r>
+        <w:t xml:space="preserve">    "success": false,</w:t>
+      </w:r>
+    </w:p>
+    <w:p>
+      <w:r>
+        <w:t xml:space="preserve">    "error": "invalid or expired token"</w:t>
+      </w:r>
+    </w:p>
+    <w:p>
+      <w:r>
+        <w:t>}</w:t>
+      </w:r>
+    </w:p>
+    <w:p>
+      <w:r>
+        <w:t>That confirms invalid JWTs cannot enter protected routes.</w:t>
+      </w:r>
+    </w:p>
+    <w:p>
+      <w:r>
+        <w:pict w14:anchorId="103A8997">
+          <v:rect id="_x0000_i1074" style="width:0;height:1.5pt" o:hralign="center" o:hrstd="t" o:hr="t" fillcolor="#a0a0a0" stroked="f"/>
+        </w:pict>
+      </w:r>
+    </w:p>
+    <w:p>
+      <w:pPr>
+        <w:rPr>
+          <w:b/>
+          <w:bCs/>
+        </w:rPr>
+      </w:pPr>
+      <w:r>
+        <w:rPr>
+          <w:b/>
+          <w:bCs/>
+        </w:rPr>
+        <w:t>What changed in this step</w:t>
+      </w:r>
+    </w:p>
+    <w:p>
+      <w:r>
+        <w:t xml:space="preserve">Previously your middleware accepted </w:t>
+      </w:r>
+      <w:r>
+        <w:rPr>
+          <w:b/>
+          <w:bCs/>
+        </w:rPr>
+        <w:t>any HMAC JWT algorithm</w:t>
+      </w:r>
+      <w:r>
+        <w:t>:</w:t>
+      </w:r>
+    </w:p>
+    <w:p>
+      <w:r>
+        <w:t xml:space="preserve">if _, </w:t>
+      </w:r>
+      <w:proofErr w:type="gramStart"/>
+      <w:r>
+        <w:t>ok :</w:t>
+      </w:r>
+      <w:proofErr w:type="gramEnd"/>
+      <w:r>
+        <w:t xml:space="preserve">= </w:t>
+      </w:r>
+      <w:proofErr w:type="spellStart"/>
+      <w:proofErr w:type="gramStart"/>
+      <w:r>
+        <w:t>t.Method</w:t>
+      </w:r>
+      <w:proofErr w:type="spellEnd"/>
+      <w:proofErr w:type="gramEnd"/>
+      <w:r>
+        <w:t>.(*</w:t>
+      </w:r>
+      <w:proofErr w:type="spellStart"/>
+      <w:proofErr w:type="gramStart"/>
+      <w:r>
+        <w:t>jwt.SigningMethodHMAC</w:t>
+      </w:r>
+      <w:proofErr w:type="spellEnd"/>
+      <w:proofErr w:type="gramEnd"/>
+      <w:r>
+        <w:t>)</w:t>
+      </w:r>
+      <w:proofErr w:type="gramStart"/>
+      <w:r>
+        <w:t>; !ok</w:t>
+      </w:r>
+      <w:proofErr w:type="gramEnd"/>
+    </w:p>
+    <w:p>
+      <w:r>
+        <w:t>That means HS256/384/512 were all potentially accepted.</w:t>
+      </w:r>
+    </w:p>
+    <w:p>
+      <w:r>
+        <w:t>Now it accepts only:</w:t>
+      </w:r>
+    </w:p>
+    <w:p>
+      <w:r>
+        <w:t>HS256</w:t>
+      </w:r>
+    </w:p>
+    <w:p>
+      <w:r>
+        <w:t>which matches your token creation:</w:t>
+      </w:r>
+    </w:p>
+    <w:p>
+      <w:proofErr w:type="gramStart"/>
+      <w:r>
+        <w:t>jwt.SigningMethodHS</w:t>
+      </w:r>
+      <w:proofErr w:type="gramEnd"/>
+      <w:r>
+        <w:t>256</w:t>
+      </w:r>
+    </w:p>
+    <w:p>
+      <w:r>
+        <w:t>We also now validate:</w:t>
+      </w:r>
+    </w:p>
+    <w:p>
+      <w:r>
+        <w:rPr>
+          <w:rFonts w:ascii="Segoe UI Symbol" w:hAnsi="Segoe UI Symbol" w:cs="Segoe UI Symbol"/>
+        </w:rPr>
+        <w:t>✓</w:t>
+      </w:r>
+      <w:r>
+        <w:t xml:space="preserve"> signature</w:t>
+      </w:r>
+    </w:p>
+    <w:p>
+      <w:r>
+        <w:rPr>
+          <w:rFonts w:ascii="Segoe UI Symbol" w:hAnsi="Segoe UI Symbol" w:cs="Segoe UI Symbol"/>
+        </w:rPr>
+        <w:t>✓</w:t>
+      </w:r>
+      <w:r>
+        <w:t xml:space="preserve"> HS256 algorithm</w:t>
+      </w:r>
+    </w:p>
+    <w:p>
+      <w:r>
+        <w:rPr>
+          <w:rFonts w:ascii="Segoe UI Symbol" w:hAnsi="Segoe UI Symbol" w:cs="Segoe UI Symbol"/>
+        </w:rPr>
+        <w:t>✓</w:t>
+      </w:r>
+      <w:r>
+        <w:t xml:space="preserve"> expiration</w:t>
+      </w:r>
+    </w:p>
+    <w:p>
+      <w:r>
+        <w:rPr>
+          <w:rFonts w:ascii="Segoe UI Symbol" w:hAnsi="Segoe UI Symbol" w:cs="Segoe UI Symbol"/>
+        </w:rPr>
+        <w:lastRenderedPageBreak/>
+        <w:t>✓</w:t>
+      </w:r>
+      <w:r>
+        <w:t xml:space="preserve"> issued-at</w:t>
+      </w:r>
+    </w:p>
+    <w:p>
+      <w:r>
+        <w:rPr>
+          <w:rFonts w:ascii="Segoe UI Symbol" w:hAnsi="Segoe UI Symbol" w:cs="Segoe UI Symbol"/>
+        </w:rPr>
+        <w:t>✓</w:t>
+      </w:r>
+      <w:r>
+        <w:t xml:space="preserve"> user identity</w:t>
+      </w:r>
+    </w:p>
+    <w:p>
+      <w:r>
+        <w:rPr>
+          <w:rFonts w:ascii="Segoe UI Symbol" w:hAnsi="Segoe UI Symbol" w:cs="Segoe UI Symbol"/>
+        </w:rPr>
+        <w:t>✓</w:t>
+      </w:r>
+      <w:r>
+        <w:t xml:space="preserve"> role range</w:t>
+      </w:r>
+    </w:p>
+    <w:p>
+      <w:r>
+        <w:t>and provide authoritative context values:</w:t>
+      </w:r>
+    </w:p>
+    <w:p>
+      <w:proofErr w:type="spellStart"/>
+      <w:r>
+        <w:t>user_id</w:t>
+      </w:r>
+      <w:proofErr w:type="spellEnd"/>
+    </w:p>
+    <w:p>
+      <w:proofErr w:type="spellStart"/>
+      <w:r>
+        <w:t>employee_id</w:t>
+      </w:r>
+      <w:proofErr w:type="spellEnd"/>
+    </w:p>
+    <w:p>
+      <w:r>
+        <w:t>username</w:t>
+      </w:r>
+    </w:p>
+    <w:p>
+      <w:proofErr w:type="spellStart"/>
+      <w:r>
+        <w:t>user_type</w:t>
+      </w:r>
+      <w:proofErr w:type="spellEnd"/>
+    </w:p>
+    <w:p>
+      <w:proofErr w:type="spellStart"/>
+      <w:r>
+        <w:t>role_code</w:t>
+      </w:r>
+      <w:proofErr w:type="spellEnd"/>
+    </w:p>
+    <w:p>
+      <w:proofErr w:type="spellStart"/>
+      <w:r>
+        <w:t>role_code</w:t>
+      </w:r>
+      <w:proofErr w:type="spellEnd"/>
+      <w:r>
+        <w:t xml:space="preserve"> is empty for current legacy tokens, which is intentional during this transition.</w:t>
+      </w:r>
+    </w:p>
+    <w:p>
+      <w:pPr>
+        <w:rPr>
+          <w:b/>
+          <w:bCs/>
+        </w:rPr>
+      </w:pPr>
+      <w:r>
+        <w:rPr>
+          <w:b/>
+          <w:bCs/>
+        </w:rPr>
+        <w:t>Do NOT update these yet</w:t>
+      </w:r>
+    </w:p>
+    <w:p>
+      <w:r>
+        <w:t>For this step, leave these exactly as they are:</w:t>
+      </w:r>
+    </w:p>
+    <w:p>
+      <w:r>
+        <w:t>backend/internal/handler/</w:t>
+      </w:r>
+      <w:proofErr w:type="spellStart"/>
+      <w:proofErr w:type="gramStart"/>
+      <w:r>
+        <w:t>auth.go</w:t>
+      </w:r>
+      <w:proofErr w:type="spellEnd"/>
+      <w:proofErr w:type="gramEnd"/>
+      <w:r>
+        <w:t xml:space="preserve">       ← don't modify yet</w:t>
+      </w:r>
+    </w:p>
+    <w:p>
+      <w:r>
+        <w:t>backend/</w:t>
+      </w:r>
+      <w:proofErr w:type="spellStart"/>
+      <w:r>
+        <w:t>cmd</w:t>
+      </w:r>
+      <w:proofErr w:type="spellEnd"/>
+      <w:r>
+        <w:t>/server/</w:t>
+      </w:r>
+      <w:proofErr w:type="spellStart"/>
+      <w:proofErr w:type="gramStart"/>
+      <w:r>
+        <w:t>main.go</w:t>
+      </w:r>
+      <w:proofErr w:type="spellEnd"/>
+      <w:proofErr w:type="gramEnd"/>
+      <w:r>
+        <w:t xml:space="preserve">             ← don't modify yet</w:t>
+      </w:r>
+    </w:p>
+    <w:p>
+      <w:r>
+        <w:t>requisition workflow                   ← don't modify yet</w:t>
+      </w:r>
+    </w:p>
+    <w:p>
+      <w:r>
+        <w:t>frontend                               ← don't modify yet</w:t>
+      </w:r>
+    </w:p>
+    <w:p>
+      <w:r>
+        <w:t>And don't disable:</w:t>
+      </w:r>
+    </w:p>
+    <w:p>
+      <w:r>
+        <w:t>admin / ADMIN-001</w:t>
+      </w:r>
+    </w:p>
+    <w:p>
+      <w:r>
+        <w:t>yet.</w:t>
+      </w:r>
+    </w:p>
+    <w:p>
+      <w:pPr>
+        <w:rPr>
+          <w:b/>
+          <w:bCs/>
+        </w:rPr>
+      </w:pPr>
+      <w:r>
+        <w:rPr>
+          <w:b/>
+          <w:bCs/>
+        </w:rPr>
+        <w:t>After this test passes</w:t>
+      </w:r>
+    </w:p>
+    <w:p>
+      <w:r>
+        <w:t xml:space="preserve">Then we go to </w:t>
+      </w:r>
+      <w:r>
+        <w:rPr>
+          <w:b/>
+          <w:bCs/>
+        </w:rPr>
+        <w:t>Step 2</w:t>
+      </w:r>
+      <w:r>
+        <w:t>:</w:t>
+      </w:r>
+    </w:p>
+    <w:p>
+      <w:r>
+        <w:t>backend/internal/handler/</w:t>
+      </w:r>
+      <w:proofErr w:type="spellStart"/>
+      <w:proofErr w:type="gramStart"/>
+      <w:r>
+        <w:t>auth.go</w:t>
+      </w:r>
+      <w:proofErr w:type="spellEnd"/>
+      <w:proofErr w:type="gramEnd"/>
+    </w:p>
+    <w:p>
+      <w:r>
+        <w:t>That is a more important change. We will make login query:</w:t>
+      </w:r>
+    </w:p>
+    <w:p>
+      <w:r>
+        <w:t>users</w:t>
+      </w:r>
+    </w:p>
+    <w:p>
+      <w:r>
+        <w:t xml:space="preserve">   +</w:t>
+      </w:r>
+    </w:p>
+    <w:p>
+      <w:proofErr w:type="spellStart"/>
+      <w:r>
+        <w:t>auth_user_roles</w:t>
+      </w:r>
+      <w:proofErr w:type="spellEnd"/>
+    </w:p>
+    <w:p>
+      <w:r>
+        <w:lastRenderedPageBreak/>
+        <w:t xml:space="preserve">   +</w:t>
+      </w:r>
+    </w:p>
+    <w:p>
+      <w:proofErr w:type="spellStart"/>
+      <w:r>
+        <w:t>auth_roles</w:t>
+      </w:r>
+      <w:proofErr w:type="spellEnd"/>
+    </w:p>
+    <w:p>
+      <w:r>
+        <w:t>instead of trusting only:</w:t>
+      </w:r>
+    </w:p>
+    <w:p>
+      <w:proofErr w:type="spellStart"/>
+      <w:r>
+        <w:t>users.user_type</w:t>
+      </w:r>
+      <w:proofErr w:type="spellEnd"/>
+    </w:p>
+    <w:p>
+      <w:r>
+        <w:t>and the new JWT will become:</w:t>
+      </w:r>
+    </w:p>
+    <w:p>
+      <w:proofErr w:type="spellStart"/>
+      <w:r>
+        <w:t>uid</w:t>
+      </w:r>
+      <w:proofErr w:type="spellEnd"/>
+      <w:r>
+        <w:t xml:space="preserve">        = users.id</w:t>
+      </w:r>
+    </w:p>
+    <w:p>
+      <w:r>
+        <w:t xml:space="preserve">emp        = </w:t>
+      </w:r>
+      <w:proofErr w:type="spellStart"/>
+      <w:r>
+        <w:t>employee_id</w:t>
+      </w:r>
+      <w:proofErr w:type="spellEnd"/>
+    </w:p>
+    <w:p>
+      <w:proofErr w:type="spellStart"/>
+      <w:r>
+        <w:t>uname</w:t>
+      </w:r>
+      <w:proofErr w:type="spellEnd"/>
+      <w:r>
+        <w:t xml:space="preserve">      = username</w:t>
+      </w:r>
+    </w:p>
+    <w:p>
+      <w:r>
+        <w:t>role       = 0/1/2/3</w:t>
+      </w:r>
+    </w:p>
+    <w:p>
+      <w:proofErr w:type="spellStart"/>
+      <w:r>
+        <w:t>role_</w:t>
+      </w:r>
+      <w:proofErr w:type="gramStart"/>
+      <w:r>
+        <w:t>code</w:t>
+      </w:r>
+      <w:proofErr w:type="spellEnd"/>
+      <w:r>
+        <w:t xml:space="preserve">  =</w:t>
+      </w:r>
+      <w:proofErr w:type="gramEnd"/>
+      <w:r>
+        <w:t xml:space="preserve"> ROOT / IT_ADMIN / IT_PERSONNEL / GENERAL_USER</w:t>
+      </w:r>
+    </w:p>
+    <w:p>
+      <w:r>
+        <w:t xml:space="preserve">We'll also fix the unsafe current </w:t>
+      </w:r>
+      <w:proofErr w:type="gramStart"/>
+      <w:r>
+        <w:t>Refresh(</w:t>
+      </w:r>
+      <w:proofErr w:type="gramEnd"/>
+      <w:r>
+        <w:t xml:space="preserve">) behavior </w:t>
+      </w:r>
+      <w:proofErr w:type="gramStart"/>
+      <w:r>
+        <w:t>because</w:t>
+      </w:r>
+      <w:proofErr w:type="gramEnd"/>
+      <w:r>
+        <w:t xml:space="preserve"> this line:</w:t>
+      </w:r>
+    </w:p>
+    <w:p>
+      <w:proofErr w:type="spellStart"/>
+      <w:proofErr w:type="gramStart"/>
+      <w:r>
+        <w:t>jwt.WithoutClaimsValidation</w:t>
+      </w:r>
+      <w:proofErr w:type="spellEnd"/>
+      <w:proofErr w:type="gramEnd"/>
+      <w:r>
+        <w:t>()</w:t>
+      </w:r>
+    </w:p>
+    <w:p>
+      <w:r>
+        <w:t xml:space="preserve">should not remain in </w:t>
+      </w:r>
+      <w:proofErr w:type="gramStart"/>
+      <w:r>
+        <w:t>the professional</w:t>
+      </w:r>
+      <w:proofErr w:type="gramEnd"/>
+      <w:r>
+        <w:t xml:space="preserve"> authentication implementation.</w:t>
+      </w:r>
+    </w:p>
+    <w:p>
+      <w:r>
+        <w:t xml:space="preserve">So complete </w:t>
+      </w:r>
+      <w:r>
+        <w:rPr>
+          <w:b/>
+          <w:bCs/>
+        </w:rPr>
+        <w:t>Steps 1–8 above first</w:t>
+      </w:r>
+      <w:r>
+        <w:t xml:space="preserve">. If go </w:t>
+      </w:r>
+      <w:proofErr w:type="spellStart"/>
+      <w:proofErr w:type="gramStart"/>
+      <w:r>
+        <w:t>test</w:t>
+      </w:r>
+      <w:proofErr w:type="spellEnd"/>
+      <w:r>
+        <w:t xml:space="preserve"> .</w:t>
+      </w:r>
+      <w:proofErr w:type="gramEnd"/>
+      <w:r>
+        <w:t>/..., login, and protected API all succeed, send me the results and we'll replace the complete backend/internal/handler/</w:t>
+      </w:r>
+      <w:proofErr w:type="spellStart"/>
+      <w:proofErr w:type="gramStart"/>
+      <w:r>
+        <w:t>auth.go</w:t>
+      </w:r>
+      <w:proofErr w:type="spellEnd"/>
+      <w:proofErr w:type="gramEnd"/>
+      <w:r>
+        <w:t xml:space="preserve"> next.</w:t>
       </w:r>
     </w:p>
     <w:p/>

</xml_diff>